<commit_message>
Update site (2026-08-07 08:02)
</commit_message>
<xml_diff>
--- a/On-Call Schedule DRAFT - Aug 31 to Nov 8 2026.docx
+++ b/On-Call Schedule DRAFT - Aug 31 to Nov 8 2026.docx
@@ -15,7 +15,7 @@
           <w:sz w:val="32"/>
           <w:szCs w:val="32"/>
         </w:rPr>
-        <w:t xml:space="preserve">PVCS On-Call Schedule — DRAFT</w:t>
+        <w:t xml:space="preserve">PVCS On-Call Schedule — DRAFT (two options)</w:t>
       </w:r>
     </w:p>
     <w:p>
@@ -32,7 +32,24 @@
           <w:sz w:val="18"/>
           <w:szCs w:val="18"/>
         </w:rPr>
-        <w:t xml:space="preserve">Aug 31 – Nov 8, 2026  ·  generated Aug 6, 2026  ·  maximum-coverage mode (day prioritized over evening; choice order and no-consecutive-weeks rule set aside; personal week counts and weekend maximums honoured)</w:t>
+        <w:t xml:space="preserve">Aug 31 – Nov 8, 2026  ·  generated Aug 6, 2026  ·  based on 11 of 18 responses  ·  choice order and no-consecutive-weeks rule set aside; personal week counts and weekend maximums honoured  ·  both options fill 37 of 40 blocks, including ALL day shifts</w:t>
+      </w:r>
+    </w:p>
+    <w:p>
+      <w:pPr>
+        <w:pStyle w:val="Heading2"/>
+        <w:spacing w:after="120" w:before="240"/>
+      </w:pPr>
+      <w:r>
+        <w:rPr>
+          <w:rFonts w:ascii="Calibri" w:cs="Calibri" w:eastAsia="Calibri" w:hAnsi="Calibri"/>
+          <w:b/>
+          <w:bCs/>
+          <w:color w:val="1F3864"/>
+          <w:sz w:val="24"/>
+          <w:szCs w:val="24"/>
+        </w:rPr>
+        <w:t xml:space="preserve">OPTION A — maximum coverage</w:t>
       </w:r>
     </w:p>
     <w:tbl>
@@ -2523,7 +2540,7 @@
           <w:sz w:val="24"/>
           <w:szCs w:val="24"/>
         </w:rPr>
-        <w:t xml:space="preserve">Open shifts (3 of 40)</w:t>
+        <w:t xml:space="preserve">Option A: open shifts (3 of 40)</w:t>
       </w:r>
     </w:p>
     <w:p>
@@ -2582,24 +2599,6 @@
     </w:p>
     <w:p>
       <w:pPr>
-        <w:spacing w:after="80"/>
-      </w:pPr>
-      <w:r>
-        <w:rPr>
-          <w:rFonts w:ascii="Calibri" w:cs="Calibri" w:eastAsia="Calibri" w:hAnsi="Calibri"/>
-          <w:b w:val="false"/>
-          <w:bCs w:val="false"/>
-          <w:i/>
-          <w:iCs/>
-          <w:color w:val="000000"/>
-          <w:sz w:val="20"/>
-          <w:szCs w:val="20"/>
-        </w:rPr>
-        <w:t xml:space="preserve">All 20 day-shift blocks are filled. Offer the three open evening blocks as individual days, or to the 7 psychiatrists who have not yet responded: Drs. Adelufosi, Bezzahou, Harrington, Paletta, Reimer, Sareen, Zylberman.</w:t>
-      </w:r>
-    </w:p>
-    <w:p>
-      <w:pPr>
         <w:pStyle w:val="Heading2"/>
         <w:spacing w:after="120" w:before="240"/>
       </w:pPr>
@@ -2612,7 +2611,7 @@
           <w:sz w:val="24"/>
           <w:szCs w:val="24"/>
         </w:rPr>
-        <w:t xml:space="preserve">Assignments vs. requests</w:t>
+        <w:t xml:space="preserve">Option A: assignments vs. requests</w:t>
       </w:r>
     </w:p>
     <w:tbl>
@@ -4306,7 +4305,7 @@
                 <w:sz w:val="18"/>
                 <w:szCs w:val="18"/>
               </w:rPr>
-              <w:t xml:space="preserve">Full weeks 4 and 7 (evening)</w:t>
+              <w:t xml:space="preserve">Full weeks 4 and 7 (evening) — 1st and 2nd choices</w:t>
             </w:r>
           </w:p>
         </w:tc>
@@ -4458,7 +4457,7 @@
                 <w:sz w:val="18"/>
                 <w:szCs w:val="18"/>
               </w:rPr>
-              <w:t xml:space="preserve">Day full week 3; evening Mon–Fri week 6</w:t>
+              <w:t xml:space="preserve">Day full week 3; evening Mon–Fri week 6 (her 1st-choice evening block)</w:t>
             </w:r>
           </w:p>
         </w:tc>
@@ -4478,7 +4477,7 @@
           <w:sz w:val="24"/>
           <w:szCs w:val="24"/>
         </w:rPr>
-        <w:t xml:space="preserve">Flags for review</w:t>
+        <w:t xml:space="preserve">Option A: flags</w:t>
       </w:r>
     </w:p>
     <w:p>
@@ -4496,7 +4495,25 @@
           <w:sz w:val="20"/>
           <w:szCs w:val="20"/>
         </w:rPr>
-        <w:t xml:space="preserve">• The no-consecutive-weeks rule was deliberately switched off. Notable stretches: Dr. Okoye works Sep 7 – Oct 4 nearly continuously (day week 2, evening week 3, day weekend 4, evening week 5); Dr. Konrad has full weeks 8 and 10.</w:t>
+        <w:t xml:space="preserve">• 5 of 11 respondents receive one of their 1st choices (Drs. Okoye, Konrad, Gill, Ruzhynsky, Sawich).</w:t>
+      </w:r>
+    </w:p>
+    <w:p>
+      <w:pPr>
+        <w:spacing w:after="80"/>
+      </w:pPr>
+      <w:r>
+        <w:rPr>
+          <w:rFonts w:ascii="Calibri" w:cs="Calibri" w:eastAsia="Calibri" w:hAnsi="Calibri"/>
+          <w:b w:val="false"/>
+          <w:bCs w:val="false"/>
+          <w:i w:val="false"/>
+          <w:iCs w:val="false"/>
+          <w:color w:val="000000"/>
+          <w:sz w:val="20"/>
+          <w:szCs w:val="20"/>
+        </w:rPr>
+        <w:t xml:space="preserve">• Dr. Okoye works Sep 7 – Oct 4 nearly continuously (day week 2, evening week 3, day weekend 4, evening week 5).</w:t>
       </w:r>
     </w:p>
     <w:p>
@@ -4515,6 +4532,4545 @@
           <w:szCs w:val="20"/>
         </w:rPr>
         <w:t xml:space="preserve">• Dr. Okoye is at all his limits (5 weekends). If he drops anything, day weekend 4 and evening weekend 6 have no other requester.</w:t>
+      </w:r>
+    </w:p>
+    <w:p>
+      <w:r>
+        <w:br w:type="page"/>
+      </w:r>
+    </w:p>
+    <w:p>
+      <w:pPr>
+        <w:pStyle w:val="Heading2"/>
+        <w:spacing w:after="120" w:before="240"/>
+      </w:pPr>
+      <w:r>
+        <w:rPr>
+          <w:rFonts w:ascii="Calibri" w:cs="Calibri" w:eastAsia="Calibri" w:hAnsi="Calibri"/>
+          <w:b/>
+          <w:bCs/>
+          <w:color w:val="1F3864"/>
+          <w:sz w:val="24"/>
+          <w:szCs w:val="24"/>
+        </w:rPr>
+        <w:t xml:space="preserve">OPTION B — same coverage, more first choices (★ = that person's 1st choice)</w:t>
+      </w:r>
+    </w:p>
+    <w:tbl>
+      <w:tblPr>
+        <w:tblW w:type="dxa" w:w="14400"/>
+        <w:tblBorders>
+          <w:top w:val="single" w:color="auto" w:sz="4"/>
+          <w:left w:val="single" w:color="auto" w:sz="4"/>
+          <w:bottom w:val="single" w:color="auto" w:sz="4"/>
+          <w:right w:val="single" w:color="auto" w:sz="4"/>
+          <w:insideH w:val="single" w:color="auto" w:sz="4"/>
+          <w:insideV w:val="single" w:color="auto" w:sz="4"/>
+        </w:tblBorders>
+      </w:tblPr>
+      <w:tblGrid>
+        <w:gridCol w:w="2400"/>
+        <w:gridCol w:w="2000"/>
+        <w:gridCol w:w="2000"/>
+        <w:gridCol w:w="2000"/>
+        <w:gridCol w:w="2000"/>
+        <w:gridCol w:w="2000"/>
+        <w:gridCol w:w="2000"/>
+      </w:tblGrid>
+      <w:tr>
+        <w:tc>
+          <w:tcPr>
+            <w:tcW w:type="dxa" w:w="2400"/>
+            <w:shd w:fill="1F3864" w:val="clear"/>
+            <w:tcMar>
+              <w:top w:type="dxa" w:w="60"/>
+              <w:left w:type="dxa" w:w="80"/>
+              <w:bottom w:type="dxa" w:w="60"/>
+              <w:right w:type="dxa" w:w="80"/>
+            </w:tcMar>
+            <w:vAlign w:val="center"/>
+          </w:tcPr>
+          <w:p>
+            <w:pPr>
+              <w:jc w:val="center"/>
+            </w:pPr>
+            <w:r>
+              <w:rPr>
+                <w:rFonts w:ascii="Calibri" w:cs="Calibri" w:eastAsia="Calibri" w:hAnsi="Calibri"/>
+                <w:b/>
+                <w:bCs/>
+                <w:i w:val="false"/>
+                <w:iCs w:val="false"/>
+                <w:color w:val="FFFFFF"/>
+                <w:sz w:val="18"/>
+                <w:szCs w:val="18"/>
+              </w:rPr>
+              <w:t xml:space="preserve"/>
+            </w:r>
+          </w:p>
+        </w:tc>
+        <w:tc>
+          <w:tcPr>
+            <w:tcW w:type="dxa" w:w="2000"/>
+            <w:shd w:fill="1F3864" w:val="clear"/>
+            <w:tcMar>
+              <w:top w:type="dxa" w:w="60"/>
+              <w:left w:type="dxa" w:w="80"/>
+              <w:bottom w:type="dxa" w:w="60"/>
+              <w:right w:type="dxa" w:w="80"/>
+            </w:tcMar>
+            <w:vAlign w:val="center"/>
+          </w:tcPr>
+          <w:p>
+            <w:pPr>
+              <w:jc w:val="center"/>
+            </w:pPr>
+            <w:r>
+              <w:rPr>
+                <w:rFonts w:ascii="Calibri" w:cs="Calibri" w:eastAsia="Calibri" w:hAnsi="Calibri"/>
+                <w:b/>
+                <w:bCs/>
+                <w:i w:val="false"/>
+                <w:iCs w:val="false"/>
+                <w:color w:val="FFFFFF"/>
+                <w:sz w:val="18"/>
+                <w:szCs w:val="18"/>
+              </w:rPr>
+              <w:t xml:space="preserve">DAY — Full week</w:t>
+            </w:r>
+          </w:p>
+        </w:tc>
+        <w:tc>
+          <w:tcPr>
+            <w:tcW w:type="dxa" w:w="2000"/>
+            <w:shd w:fill="1F3864" w:val="clear"/>
+            <w:tcMar>
+              <w:top w:type="dxa" w:w="60"/>
+              <w:left w:type="dxa" w:w="80"/>
+              <w:bottom w:type="dxa" w:w="60"/>
+              <w:right w:type="dxa" w:w="80"/>
+            </w:tcMar>
+            <w:vAlign w:val="center"/>
+          </w:tcPr>
+          <w:p>
+            <w:pPr>
+              <w:jc w:val="center"/>
+            </w:pPr>
+            <w:r>
+              <w:rPr>
+                <w:rFonts w:ascii="Calibri" w:cs="Calibri" w:eastAsia="Calibri" w:hAnsi="Calibri"/>
+                <w:b/>
+                <w:bCs/>
+                <w:i w:val="false"/>
+                <w:iCs w:val="false"/>
+                <w:color w:val="FFFFFF"/>
+                <w:sz w:val="18"/>
+                <w:szCs w:val="18"/>
+              </w:rPr>
+              <w:t xml:space="preserve">DAY — Mon–Fri</w:t>
+            </w:r>
+          </w:p>
+        </w:tc>
+        <w:tc>
+          <w:tcPr>
+            <w:tcW w:type="dxa" w:w="2000"/>
+            <w:shd w:fill="1F3864" w:val="clear"/>
+            <w:tcMar>
+              <w:top w:type="dxa" w:w="60"/>
+              <w:left w:type="dxa" w:w="80"/>
+              <w:bottom w:type="dxa" w:w="60"/>
+              <w:right w:type="dxa" w:w="80"/>
+            </w:tcMar>
+            <w:vAlign w:val="center"/>
+          </w:tcPr>
+          <w:p>
+            <w:pPr>
+              <w:jc w:val="center"/>
+            </w:pPr>
+            <w:r>
+              <w:rPr>
+                <w:rFonts w:ascii="Calibri" w:cs="Calibri" w:eastAsia="Calibri" w:hAnsi="Calibri"/>
+                <w:b/>
+                <w:bCs/>
+                <w:i w:val="false"/>
+                <w:iCs w:val="false"/>
+                <w:color w:val="FFFFFF"/>
+                <w:sz w:val="18"/>
+                <w:szCs w:val="18"/>
+              </w:rPr>
+              <w:t xml:space="preserve">DAY — Weekend</w:t>
+            </w:r>
+          </w:p>
+        </w:tc>
+        <w:tc>
+          <w:tcPr>
+            <w:tcW w:type="dxa" w:w="2000"/>
+            <w:shd w:fill="1F3864" w:val="clear"/>
+            <w:tcMar>
+              <w:top w:type="dxa" w:w="60"/>
+              <w:left w:type="dxa" w:w="80"/>
+              <w:bottom w:type="dxa" w:w="60"/>
+              <w:right w:type="dxa" w:w="80"/>
+            </w:tcMar>
+            <w:vAlign w:val="center"/>
+          </w:tcPr>
+          <w:p>
+            <w:pPr>
+              <w:jc w:val="center"/>
+            </w:pPr>
+            <w:r>
+              <w:rPr>
+                <w:rFonts w:ascii="Calibri" w:cs="Calibri" w:eastAsia="Calibri" w:hAnsi="Calibri"/>
+                <w:b/>
+                <w:bCs/>
+                <w:i w:val="false"/>
+                <w:iCs w:val="false"/>
+                <w:color w:val="FFFFFF"/>
+                <w:sz w:val="18"/>
+                <w:szCs w:val="18"/>
+              </w:rPr>
+              <w:t xml:space="preserve">EVENING — Full week</w:t>
+            </w:r>
+          </w:p>
+        </w:tc>
+        <w:tc>
+          <w:tcPr>
+            <w:tcW w:type="dxa" w:w="2000"/>
+            <w:shd w:fill="1F3864" w:val="clear"/>
+            <w:tcMar>
+              <w:top w:type="dxa" w:w="60"/>
+              <w:left w:type="dxa" w:w="80"/>
+              <w:bottom w:type="dxa" w:w="60"/>
+              <w:right w:type="dxa" w:w="80"/>
+            </w:tcMar>
+            <w:vAlign w:val="center"/>
+          </w:tcPr>
+          <w:p>
+            <w:pPr>
+              <w:jc w:val="center"/>
+            </w:pPr>
+            <w:r>
+              <w:rPr>
+                <w:rFonts w:ascii="Calibri" w:cs="Calibri" w:eastAsia="Calibri" w:hAnsi="Calibri"/>
+                <w:b/>
+                <w:bCs/>
+                <w:i w:val="false"/>
+                <w:iCs w:val="false"/>
+                <w:color w:val="FFFFFF"/>
+                <w:sz w:val="18"/>
+                <w:szCs w:val="18"/>
+              </w:rPr>
+              <w:t xml:space="preserve">EVENING — Mon–Fri</w:t>
+            </w:r>
+          </w:p>
+        </w:tc>
+        <w:tc>
+          <w:tcPr>
+            <w:tcW w:type="dxa" w:w="2000"/>
+            <w:shd w:fill="1F3864" w:val="clear"/>
+            <w:tcMar>
+              <w:top w:type="dxa" w:w="60"/>
+              <w:left w:type="dxa" w:w="80"/>
+              <w:bottom w:type="dxa" w:w="60"/>
+              <w:right w:type="dxa" w:w="80"/>
+            </w:tcMar>
+            <w:vAlign w:val="center"/>
+          </w:tcPr>
+          <w:p>
+            <w:pPr>
+              <w:jc w:val="center"/>
+            </w:pPr>
+            <w:r>
+              <w:rPr>
+                <w:rFonts w:ascii="Calibri" w:cs="Calibri" w:eastAsia="Calibri" w:hAnsi="Calibri"/>
+                <w:b/>
+                <w:bCs/>
+                <w:i w:val="false"/>
+                <w:iCs w:val="false"/>
+                <w:color w:val="FFFFFF"/>
+                <w:sz w:val="18"/>
+                <w:szCs w:val="18"/>
+              </w:rPr>
+              <w:t xml:space="preserve">EVENING — Weekend</w:t>
+            </w:r>
+          </w:p>
+        </w:tc>
+      </w:tr>
+      <w:tr>
+        <w:tc>
+          <w:tcPr>
+            <w:tcW w:type="dxa" w:w="2400"/>
+            <w:tcMar>
+              <w:top w:type="dxa" w:w="60"/>
+              <w:left w:type="dxa" w:w="80"/>
+              <w:bottom w:type="dxa" w:w="60"/>
+              <w:right w:type="dxa" w:w="80"/>
+            </w:tcMar>
+            <w:vAlign w:val="center"/>
+          </w:tcPr>
+          <w:p>
+            <w:pPr>
+              <w:jc w:val="center"/>
+            </w:pPr>
+            <w:r>
+              <w:rPr>
+                <w:rFonts w:ascii="Calibri" w:cs="Calibri" w:eastAsia="Calibri" w:hAnsi="Calibri"/>
+                <w:b/>
+                <w:bCs/>
+                <w:sz w:val="18"/>
+                <w:szCs w:val="18"/>
+              </w:rPr>
+              <w:t xml:space="preserve">Week 1</w:t>
+            </w:r>
+          </w:p>
+          <w:p>
+            <w:pPr>
+              <w:jc w:val="center"/>
+            </w:pPr>
+            <w:r>
+              <w:rPr>
+                <w:rFonts w:ascii="Calibri" w:cs="Calibri" w:eastAsia="Calibri" w:hAnsi="Calibri"/>
+                <w:color w:val="666666"/>
+                <w:sz w:val="16"/>
+                <w:szCs w:val="16"/>
+              </w:rPr>
+              <w:t xml:space="preserve">Aug 31 – Sep 6</w:t>
+            </w:r>
+          </w:p>
+        </w:tc>
+        <w:tc>
+          <w:tcPr>
+            <w:tcW w:type="dxa" w:w="2000"/>
+            <w:tcMar>
+              <w:top w:type="dxa" w:w="60"/>
+              <w:left w:type="dxa" w:w="80"/>
+              <w:bottom w:type="dxa" w:w="60"/>
+              <w:right w:type="dxa" w:w="80"/>
+            </w:tcMar>
+            <w:vAlign w:val="center"/>
+          </w:tcPr>
+          <w:p>
+            <w:pPr>
+              <w:jc w:val="center"/>
+            </w:pPr>
+            <w:r>
+              <w:rPr>
+                <w:rFonts w:ascii="Calibri" w:cs="Calibri" w:eastAsia="Calibri" w:hAnsi="Calibri"/>
+                <w:b w:val="false"/>
+                <w:bCs w:val="false"/>
+                <w:i w:val="false"/>
+                <w:iCs w:val="false"/>
+                <w:color w:val="000000"/>
+                <w:sz w:val="18"/>
+                <w:szCs w:val="18"/>
+              </w:rPr>
+              <w:t xml:space="preserve">Dr. Kuzenko</w:t>
+            </w:r>
+          </w:p>
+        </w:tc>
+        <w:tc>
+          <w:tcPr>
+            <w:tcW w:type="dxa" w:w="2000"/>
+            <w:tcMar>
+              <w:top w:type="dxa" w:w="60"/>
+              <w:left w:type="dxa" w:w="80"/>
+              <w:bottom w:type="dxa" w:w="60"/>
+              <w:right w:type="dxa" w:w="80"/>
+            </w:tcMar>
+            <w:vAlign w:val="center"/>
+          </w:tcPr>
+          <w:p>
+            <w:pPr>
+              <w:jc w:val="center"/>
+            </w:pPr>
+            <w:r>
+              <w:rPr>
+                <w:rFonts w:ascii="Calibri" w:cs="Calibri" w:eastAsia="Calibri" w:hAnsi="Calibri"/>
+                <w:b w:val="false"/>
+                <w:bCs w:val="false"/>
+                <w:i/>
+                <w:iCs/>
+                <w:color w:val="666666"/>
+                <w:sz w:val="16"/>
+                <w:szCs w:val="16"/>
+              </w:rPr>
+              <w:t xml:space="preserve">(covered by full week)</w:t>
+            </w:r>
+          </w:p>
+        </w:tc>
+        <w:tc>
+          <w:tcPr>
+            <w:tcW w:type="dxa" w:w="2000"/>
+            <w:tcMar>
+              <w:top w:type="dxa" w:w="60"/>
+              <w:left w:type="dxa" w:w="80"/>
+              <w:bottom w:type="dxa" w:w="60"/>
+              <w:right w:type="dxa" w:w="80"/>
+            </w:tcMar>
+            <w:vAlign w:val="center"/>
+          </w:tcPr>
+          <w:p>
+            <w:pPr>
+              <w:jc w:val="center"/>
+            </w:pPr>
+            <w:r>
+              <w:rPr>
+                <w:rFonts w:ascii="Calibri" w:cs="Calibri" w:eastAsia="Calibri" w:hAnsi="Calibri"/>
+                <w:b w:val="false"/>
+                <w:bCs w:val="false"/>
+                <w:i/>
+                <w:iCs/>
+                <w:color w:val="666666"/>
+                <w:sz w:val="16"/>
+                <w:szCs w:val="16"/>
+              </w:rPr>
+              <w:t xml:space="preserve">(covered by full week)</w:t>
+            </w:r>
+          </w:p>
+        </w:tc>
+        <w:tc>
+          <w:tcPr>
+            <w:tcW w:type="dxa" w:w="2000"/>
+            <w:tcMar>
+              <w:top w:type="dxa" w:w="60"/>
+              <w:left w:type="dxa" w:w="80"/>
+              <w:bottom w:type="dxa" w:w="60"/>
+              <w:right w:type="dxa" w:w="80"/>
+            </w:tcMar>
+            <w:vAlign w:val="center"/>
+          </w:tcPr>
+          <w:p>
+            <w:pPr>
+              <w:jc w:val="center"/>
+            </w:pPr>
+            <w:r>
+              <w:rPr>
+                <w:rFonts w:ascii="Calibri" w:cs="Calibri" w:eastAsia="Calibri" w:hAnsi="Calibri"/>
+                <w:b w:val="false"/>
+                <w:bCs w:val="false"/>
+                <w:i w:val="false"/>
+                <w:iCs w:val="false"/>
+                <w:color w:val="000000"/>
+                <w:sz w:val="18"/>
+                <w:szCs w:val="18"/>
+              </w:rPr>
+              <w:t xml:space="preserve">—</w:t>
+            </w:r>
+          </w:p>
+        </w:tc>
+        <w:tc>
+          <w:tcPr>
+            <w:tcW w:type="dxa" w:w="2000"/>
+            <w:shd w:fill="FFF2A8" w:val="clear"/>
+            <w:tcMar>
+              <w:top w:type="dxa" w:w="60"/>
+              <w:left w:type="dxa" w:w="80"/>
+              <w:bottom w:type="dxa" w:w="60"/>
+              <w:right w:type="dxa" w:w="80"/>
+            </w:tcMar>
+            <w:vAlign w:val="center"/>
+          </w:tcPr>
+          <w:p>
+            <w:pPr>
+              <w:jc w:val="center"/>
+            </w:pPr>
+            <w:r>
+              <w:rPr>
+                <w:rFonts w:ascii="Calibri" w:cs="Calibri" w:eastAsia="Calibri" w:hAnsi="Calibri"/>
+                <w:b/>
+                <w:bCs/>
+                <w:i w:val="false"/>
+                <w:iCs w:val="false"/>
+                <w:color w:val="C00000"/>
+                <w:sz w:val="18"/>
+                <w:szCs w:val="18"/>
+              </w:rPr>
+              <w:t xml:space="preserve">OPEN</w:t>
+            </w:r>
+          </w:p>
+        </w:tc>
+        <w:tc>
+          <w:tcPr>
+            <w:tcW w:type="dxa" w:w="2000"/>
+            <w:shd w:fill="FFF2A8" w:val="clear"/>
+            <w:tcMar>
+              <w:top w:type="dxa" w:w="60"/>
+              <w:left w:type="dxa" w:w="80"/>
+              <w:bottom w:type="dxa" w:w="60"/>
+              <w:right w:type="dxa" w:w="80"/>
+            </w:tcMar>
+            <w:vAlign w:val="center"/>
+          </w:tcPr>
+          <w:p>
+            <w:pPr>
+              <w:jc w:val="center"/>
+            </w:pPr>
+            <w:r>
+              <w:rPr>
+                <w:rFonts w:ascii="Calibri" w:cs="Calibri" w:eastAsia="Calibri" w:hAnsi="Calibri"/>
+                <w:b/>
+                <w:bCs/>
+                <w:i w:val="false"/>
+                <w:iCs w:val="false"/>
+                <w:color w:val="C00000"/>
+                <w:sz w:val="18"/>
+                <w:szCs w:val="18"/>
+              </w:rPr>
+              <w:t xml:space="preserve">OPEN</w:t>
+            </w:r>
+          </w:p>
+        </w:tc>
+      </w:tr>
+      <w:tr>
+        <w:tc>
+          <w:tcPr>
+            <w:tcW w:type="dxa" w:w="2400"/>
+            <w:tcMar>
+              <w:top w:type="dxa" w:w="60"/>
+              <w:left w:type="dxa" w:w="80"/>
+              <w:bottom w:type="dxa" w:w="60"/>
+              <w:right w:type="dxa" w:w="80"/>
+            </w:tcMar>
+            <w:vAlign w:val="center"/>
+          </w:tcPr>
+          <w:p>
+            <w:pPr>
+              <w:jc w:val="center"/>
+            </w:pPr>
+            <w:r>
+              <w:rPr>
+                <w:rFonts w:ascii="Calibri" w:cs="Calibri" w:eastAsia="Calibri" w:hAnsi="Calibri"/>
+                <w:b/>
+                <w:bCs/>
+                <w:sz w:val="18"/>
+                <w:szCs w:val="18"/>
+              </w:rPr>
+              <w:t xml:space="preserve">Week 2</w:t>
+            </w:r>
+          </w:p>
+          <w:p>
+            <w:pPr>
+              <w:jc w:val="center"/>
+            </w:pPr>
+            <w:r>
+              <w:rPr>
+                <w:rFonts w:ascii="Calibri" w:cs="Calibri" w:eastAsia="Calibri" w:hAnsi="Calibri"/>
+                <w:color w:val="666666"/>
+                <w:sz w:val="16"/>
+                <w:szCs w:val="16"/>
+              </w:rPr>
+              <w:t xml:space="preserve">Sep 7 – Sep 13</w:t>
+            </w:r>
+          </w:p>
+        </w:tc>
+        <w:tc>
+          <w:tcPr>
+            <w:tcW w:type="dxa" w:w="2000"/>
+            <w:tcMar>
+              <w:top w:type="dxa" w:w="60"/>
+              <w:left w:type="dxa" w:w="80"/>
+              <w:bottom w:type="dxa" w:w="60"/>
+              <w:right w:type="dxa" w:w="80"/>
+            </w:tcMar>
+            <w:vAlign w:val="center"/>
+          </w:tcPr>
+          <w:p>
+            <w:pPr>
+              <w:jc w:val="center"/>
+            </w:pPr>
+            <w:r>
+              <w:rPr>
+                <w:rFonts w:ascii="Calibri" w:cs="Calibri" w:eastAsia="Calibri" w:hAnsi="Calibri"/>
+                <w:b w:val="false"/>
+                <w:bCs w:val="false"/>
+                <w:i w:val="false"/>
+                <w:iCs w:val="false"/>
+                <w:color w:val="000000"/>
+                <w:sz w:val="18"/>
+                <w:szCs w:val="18"/>
+              </w:rPr>
+              <w:t xml:space="preserve">Dr. Classen</w:t>
+            </w:r>
+          </w:p>
+        </w:tc>
+        <w:tc>
+          <w:tcPr>
+            <w:tcW w:type="dxa" w:w="2000"/>
+            <w:tcMar>
+              <w:top w:type="dxa" w:w="60"/>
+              <w:left w:type="dxa" w:w="80"/>
+              <w:bottom w:type="dxa" w:w="60"/>
+              <w:right w:type="dxa" w:w="80"/>
+            </w:tcMar>
+            <w:vAlign w:val="center"/>
+          </w:tcPr>
+          <w:p>
+            <w:pPr>
+              <w:jc w:val="center"/>
+            </w:pPr>
+            <w:r>
+              <w:rPr>
+                <w:rFonts w:ascii="Calibri" w:cs="Calibri" w:eastAsia="Calibri" w:hAnsi="Calibri"/>
+                <w:b w:val="false"/>
+                <w:bCs w:val="false"/>
+                <w:i/>
+                <w:iCs/>
+                <w:color w:val="666666"/>
+                <w:sz w:val="16"/>
+                <w:szCs w:val="16"/>
+              </w:rPr>
+              <w:t xml:space="preserve">(covered by full week)</w:t>
+            </w:r>
+          </w:p>
+        </w:tc>
+        <w:tc>
+          <w:tcPr>
+            <w:tcW w:type="dxa" w:w="2000"/>
+            <w:tcMar>
+              <w:top w:type="dxa" w:w="60"/>
+              <w:left w:type="dxa" w:w="80"/>
+              <w:bottom w:type="dxa" w:w="60"/>
+              <w:right w:type="dxa" w:w="80"/>
+            </w:tcMar>
+            <w:vAlign w:val="center"/>
+          </w:tcPr>
+          <w:p>
+            <w:pPr>
+              <w:jc w:val="center"/>
+            </w:pPr>
+            <w:r>
+              <w:rPr>
+                <w:rFonts w:ascii="Calibri" w:cs="Calibri" w:eastAsia="Calibri" w:hAnsi="Calibri"/>
+                <w:b w:val="false"/>
+                <w:bCs w:val="false"/>
+                <w:i/>
+                <w:iCs/>
+                <w:color w:val="666666"/>
+                <w:sz w:val="16"/>
+                <w:szCs w:val="16"/>
+              </w:rPr>
+              <w:t xml:space="preserve">(covered by full week)</w:t>
+            </w:r>
+          </w:p>
+        </w:tc>
+        <w:tc>
+          <w:tcPr>
+            <w:tcW w:type="dxa" w:w="2000"/>
+            <w:tcMar>
+              <w:top w:type="dxa" w:w="60"/>
+              <w:left w:type="dxa" w:w="80"/>
+              <w:bottom w:type="dxa" w:w="60"/>
+              <w:right w:type="dxa" w:w="80"/>
+            </w:tcMar>
+            <w:vAlign w:val="center"/>
+          </w:tcPr>
+          <w:p>
+            <w:pPr>
+              <w:jc w:val="center"/>
+            </w:pPr>
+            <w:r>
+              <w:rPr>
+                <w:rFonts w:ascii="Calibri" w:cs="Calibri" w:eastAsia="Calibri" w:hAnsi="Calibri"/>
+                <w:b w:val="false"/>
+                <w:bCs w:val="false"/>
+                <w:i w:val="false"/>
+                <w:iCs w:val="false"/>
+                <w:color w:val="000000"/>
+                <w:sz w:val="18"/>
+                <w:szCs w:val="18"/>
+              </w:rPr>
+              <w:t xml:space="preserve">Dr. Okoye ★</w:t>
+            </w:r>
+          </w:p>
+        </w:tc>
+        <w:tc>
+          <w:tcPr>
+            <w:tcW w:type="dxa" w:w="2000"/>
+            <w:tcMar>
+              <w:top w:type="dxa" w:w="60"/>
+              <w:left w:type="dxa" w:w="80"/>
+              <w:bottom w:type="dxa" w:w="60"/>
+              <w:right w:type="dxa" w:w="80"/>
+            </w:tcMar>
+            <w:vAlign w:val="center"/>
+          </w:tcPr>
+          <w:p>
+            <w:pPr>
+              <w:jc w:val="center"/>
+            </w:pPr>
+            <w:r>
+              <w:rPr>
+                <w:rFonts w:ascii="Calibri" w:cs="Calibri" w:eastAsia="Calibri" w:hAnsi="Calibri"/>
+                <w:b w:val="false"/>
+                <w:bCs w:val="false"/>
+                <w:i/>
+                <w:iCs/>
+                <w:color w:val="666666"/>
+                <w:sz w:val="16"/>
+                <w:szCs w:val="16"/>
+              </w:rPr>
+              <w:t xml:space="preserve">(covered by full week)</w:t>
+            </w:r>
+          </w:p>
+        </w:tc>
+        <w:tc>
+          <w:tcPr>
+            <w:tcW w:type="dxa" w:w="2000"/>
+            <w:tcMar>
+              <w:top w:type="dxa" w:w="60"/>
+              <w:left w:type="dxa" w:w="80"/>
+              <w:bottom w:type="dxa" w:w="60"/>
+              <w:right w:type="dxa" w:w="80"/>
+            </w:tcMar>
+            <w:vAlign w:val="center"/>
+          </w:tcPr>
+          <w:p>
+            <w:pPr>
+              <w:jc w:val="center"/>
+            </w:pPr>
+            <w:r>
+              <w:rPr>
+                <w:rFonts w:ascii="Calibri" w:cs="Calibri" w:eastAsia="Calibri" w:hAnsi="Calibri"/>
+                <w:b w:val="false"/>
+                <w:bCs w:val="false"/>
+                <w:i/>
+                <w:iCs/>
+                <w:color w:val="666666"/>
+                <w:sz w:val="16"/>
+                <w:szCs w:val="16"/>
+              </w:rPr>
+              <w:t xml:space="preserve">(covered by full week)</w:t>
+            </w:r>
+          </w:p>
+        </w:tc>
+      </w:tr>
+      <w:tr>
+        <w:tc>
+          <w:tcPr>
+            <w:tcW w:type="dxa" w:w="2400"/>
+            <w:tcMar>
+              <w:top w:type="dxa" w:w="60"/>
+              <w:left w:type="dxa" w:w="80"/>
+              <w:bottom w:type="dxa" w:w="60"/>
+              <w:right w:type="dxa" w:w="80"/>
+            </w:tcMar>
+            <w:vAlign w:val="center"/>
+          </w:tcPr>
+          <w:p>
+            <w:pPr>
+              <w:jc w:val="center"/>
+            </w:pPr>
+            <w:r>
+              <w:rPr>
+                <w:rFonts w:ascii="Calibri" w:cs="Calibri" w:eastAsia="Calibri" w:hAnsi="Calibri"/>
+                <w:b/>
+                <w:bCs/>
+                <w:sz w:val="18"/>
+                <w:szCs w:val="18"/>
+              </w:rPr>
+              <w:t xml:space="preserve">Week 3</w:t>
+            </w:r>
+          </w:p>
+          <w:p>
+            <w:pPr>
+              <w:jc w:val="center"/>
+            </w:pPr>
+            <w:r>
+              <w:rPr>
+                <w:rFonts w:ascii="Calibri" w:cs="Calibri" w:eastAsia="Calibri" w:hAnsi="Calibri"/>
+                <w:color w:val="666666"/>
+                <w:sz w:val="16"/>
+                <w:szCs w:val="16"/>
+              </w:rPr>
+              <w:t xml:space="preserve">Sep 14 – Sep 20</w:t>
+            </w:r>
+          </w:p>
+        </w:tc>
+        <w:tc>
+          <w:tcPr>
+            <w:tcW w:type="dxa" w:w="2000"/>
+            <w:tcMar>
+              <w:top w:type="dxa" w:w="60"/>
+              <w:left w:type="dxa" w:w="80"/>
+              <w:bottom w:type="dxa" w:w="60"/>
+              <w:right w:type="dxa" w:w="80"/>
+            </w:tcMar>
+            <w:vAlign w:val="center"/>
+          </w:tcPr>
+          <w:p>
+            <w:pPr>
+              <w:jc w:val="center"/>
+            </w:pPr>
+            <w:r>
+              <w:rPr>
+                <w:rFonts w:ascii="Calibri" w:cs="Calibri" w:eastAsia="Calibri" w:hAnsi="Calibri"/>
+                <w:b w:val="false"/>
+                <w:bCs w:val="false"/>
+                <w:i w:val="false"/>
+                <w:iCs w:val="false"/>
+                <w:color w:val="000000"/>
+                <w:sz w:val="18"/>
+                <w:szCs w:val="18"/>
+              </w:rPr>
+              <w:t xml:space="preserve">Dr. Okoye</w:t>
+            </w:r>
+          </w:p>
+        </w:tc>
+        <w:tc>
+          <w:tcPr>
+            <w:tcW w:type="dxa" w:w="2000"/>
+            <w:tcMar>
+              <w:top w:type="dxa" w:w="60"/>
+              <w:left w:type="dxa" w:w="80"/>
+              <w:bottom w:type="dxa" w:w="60"/>
+              <w:right w:type="dxa" w:w="80"/>
+            </w:tcMar>
+            <w:vAlign w:val="center"/>
+          </w:tcPr>
+          <w:p>
+            <w:pPr>
+              <w:jc w:val="center"/>
+            </w:pPr>
+            <w:r>
+              <w:rPr>
+                <w:rFonts w:ascii="Calibri" w:cs="Calibri" w:eastAsia="Calibri" w:hAnsi="Calibri"/>
+                <w:b w:val="false"/>
+                <w:bCs w:val="false"/>
+                <w:i/>
+                <w:iCs/>
+                <w:color w:val="666666"/>
+                <w:sz w:val="16"/>
+                <w:szCs w:val="16"/>
+              </w:rPr>
+              <w:t xml:space="preserve">(covered by full week)</w:t>
+            </w:r>
+          </w:p>
+        </w:tc>
+        <w:tc>
+          <w:tcPr>
+            <w:tcW w:type="dxa" w:w="2000"/>
+            <w:tcMar>
+              <w:top w:type="dxa" w:w="60"/>
+              <w:left w:type="dxa" w:w="80"/>
+              <w:bottom w:type="dxa" w:w="60"/>
+              <w:right w:type="dxa" w:w="80"/>
+            </w:tcMar>
+            <w:vAlign w:val="center"/>
+          </w:tcPr>
+          <w:p>
+            <w:pPr>
+              <w:jc w:val="center"/>
+            </w:pPr>
+            <w:r>
+              <w:rPr>
+                <w:rFonts w:ascii="Calibri" w:cs="Calibri" w:eastAsia="Calibri" w:hAnsi="Calibri"/>
+                <w:b w:val="false"/>
+                <w:bCs w:val="false"/>
+                <w:i/>
+                <w:iCs/>
+                <w:color w:val="666666"/>
+                <w:sz w:val="16"/>
+                <w:szCs w:val="16"/>
+              </w:rPr>
+              <w:t xml:space="preserve">(covered by full week)</w:t>
+            </w:r>
+          </w:p>
+        </w:tc>
+        <w:tc>
+          <w:tcPr>
+            <w:tcW w:type="dxa" w:w="2000"/>
+            <w:tcMar>
+              <w:top w:type="dxa" w:w="60"/>
+              <w:left w:type="dxa" w:w="80"/>
+              <w:bottom w:type="dxa" w:w="60"/>
+              <w:right w:type="dxa" w:w="80"/>
+            </w:tcMar>
+            <w:vAlign w:val="center"/>
+          </w:tcPr>
+          <w:p>
+            <w:pPr>
+              <w:jc w:val="center"/>
+            </w:pPr>
+            <w:r>
+              <w:rPr>
+                <w:rFonts w:ascii="Calibri" w:cs="Calibri" w:eastAsia="Calibri" w:hAnsi="Calibri"/>
+                <w:b w:val="false"/>
+                <w:bCs w:val="false"/>
+                <w:i w:val="false"/>
+                <w:iCs w:val="false"/>
+                <w:color w:val="000000"/>
+                <w:sz w:val="18"/>
+                <w:szCs w:val="18"/>
+              </w:rPr>
+              <w:t xml:space="preserve">—</w:t>
+            </w:r>
+          </w:p>
+        </w:tc>
+        <w:tc>
+          <w:tcPr>
+            <w:tcW w:type="dxa" w:w="2000"/>
+            <w:tcMar>
+              <w:top w:type="dxa" w:w="60"/>
+              <w:left w:type="dxa" w:w="80"/>
+              <w:bottom w:type="dxa" w:w="60"/>
+              <w:right w:type="dxa" w:w="80"/>
+            </w:tcMar>
+            <w:vAlign w:val="center"/>
+          </w:tcPr>
+          <w:p>
+            <w:pPr>
+              <w:jc w:val="center"/>
+            </w:pPr>
+            <w:r>
+              <w:rPr>
+                <w:rFonts w:ascii="Calibri" w:cs="Calibri" w:eastAsia="Calibri" w:hAnsi="Calibri"/>
+                <w:b w:val="false"/>
+                <w:bCs w:val="false"/>
+                <w:i w:val="false"/>
+                <w:iCs w:val="false"/>
+                <w:color w:val="000000"/>
+                <w:sz w:val="18"/>
+                <w:szCs w:val="18"/>
+              </w:rPr>
+              <w:t xml:space="preserve">Dr. Sawich</w:t>
+            </w:r>
+          </w:p>
+        </w:tc>
+        <w:tc>
+          <w:tcPr>
+            <w:tcW w:type="dxa" w:w="2000"/>
+            <w:shd w:fill="FFF2A8" w:val="clear"/>
+            <w:tcMar>
+              <w:top w:type="dxa" w:w="60"/>
+              <w:left w:type="dxa" w:w="80"/>
+              <w:bottom w:type="dxa" w:w="60"/>
+              <w:right w:type="dxa" w:w="80"/>
+            </w:tcMar>
+            <w:vAlign w:val="center"/>
+          </w:tcPr>
+          <w:p>
+            <w:pPr>
+              <w:jc w:val="center"/>
+            </w:pPr>
+            <w:r>
+              <w:rPr>
+                <w:rFonts w:ascii="Calibri" w:cs="Calibri" w:eastAsia="Calibri" w:hAnsi="Calibri"/>
+                <w:b/>
+                <w:bCs/>
+                <w:i w:val="false"/>
+                <w:iCs w:val="false"/>
+                <w:color w:val="C00000"/>
+                <w:sz w:val="18"/>
+                <w:szCs w:val="18"/>
+              </w:rPr>
+              <w:t xml:space="preserve">OPEN</w:t>
+            </w:r>
+          </w:p>
+        </w:tc>
+      </w:tr>
+      <w:tr>
+        <w:tc>
+          <w:tcPr>
+            <w:tcW w:type="dxa" w:w="2400"/>
+            <w:tcMar>
+              <w:top w:type="dxa" w:w="60"/>
+              <w:left w:type="dxa" w:w="80"/>
+              <w:bottom w:type="dxa" w:w="60"/>
+              <w:right w:type="dxa" w:w="80"/>
+            </w:tcMar>
+            <w:vAlign w:val="center"/>
+          </w:tcPr>
+          <w:p>
+            <w:pPr>
+              <w:jc w:val="center"/>
+            </w:pPr>
+            <w:r>
+              <w:rPr>
+                <w:rFonts w:ascii="Calibri" w:cs="Calibri" w:eastAsia="Calibri" w:hAnsi="Calibri"/>
+                <w:b/>
+                <w:bCs/>
+                <w:sz w:val="18"/>
+                <w:szCs w:val="18"/>
+              </w:rPr>
+              <w:t xml:space="preserve">Week 4</w:t>
+            </w:r>
+          </w:p>
+          <w:p>
+            <w:pPr>
+              <w:jc w:val="center"/>
+            </w:pPr>
+            <w:r>
+              <w:rPr>
+                <w:rFonts w:ascii="Calibri" w:cs="Calibri" w:eastAsia="Calibri" w:hAnsi="Calibri"/>
+                <w:color w:val="666666"/>
+                <w:sz w:val="16"/>
+                <w:szCs w:val="16"/>
+              </w:rPr>
+              <w:t xml:space="preserve">Sep 21 – Sep 27</w:t>
+            </w:r>
+          </w:p>
+        </w:tc>
+        <w:tc>
+          <w:tcPr>
+            <w:tcW w:type="dxa" w:w="2000"/>
+            <w:tcMar>
+              <w:top w:type="dxa" w:w="60"/>
+              <w:left w:type="dxa" w:w="80"/>
+              <w:bottom w:type="dxa" w:w="60"/>
+              <w:right w:type="dxa" w:w="80"/>
+            </w:tcMar>
+            <w:vAlign w:val="center"/>
+          </w:tcPr>
+          <w:p>
+            <w:pPr>
+              <w:jc w:val="center"/>
+            </w:pPr>
+            <w:r>
+              <w:rPr>
+                <w:rFonts w:ascii="Calibri" w:cs="Calibri" w:eastAsia="Calibri" w:hAnsi="Calibri"/>
+                <w:b w:val="false"/>
+                <w:bCs w:val="false"/>
+                <w:i w:val="false"/>
+                <w:iCs w:val="false"/>
+                <w:color w:val="000000"/>
+                <w:sz w:val="18"/>
+                <w:szCs w:val="18"/>
+              </w:rPr>
+              <w:t xml:space="preserve">—</w:t>
+            </w:r>
+          </w:p>
+        </w:tc>
+        <w:tc>
+          <w:tcPr>
+            <w:tcW w:type="dxa" w:w="2000"/>
+            <w:tcMar>
+              <w:top w:type="dxa" w:w="60"/>
+              <w:left w:type="dxa" w:w="80"/>
+              <w:bottom w:type="dxa" w:w="60"/>
+              <w:right w:type="dxa" w:w="80"/>
+            </w:tcMar>
+            <w:vAlign w:val="center"/>
+          </w:tcPr>
+          <w:p>
+            <w:pPr>
+              <w:jc w:val="center"/>
+            </w:pPr>
+            <w:r>
+              <w:rPr>
+                <w:rFonts w:ascii="Calibri" w:cs="Calibri" w:eastAsia="Calibri" w:hAnsi="Calibri"/>
+                <w:b w:val="false"/>
+                <w:bCs w:val="false"/>
+                <w:i w:val="false"/>
+                <w:iCs w:val="false"/>
+                <w:color w:val="000000"/>
+                <w:sz w:val="18"/>
+                <w:szCs w:val="18"/>
+              </w:rPr>
+              <w:t xml:space="preserve">Dr. Brainch</w:t>
+            </w:r>
+          </w:p>
+        </w:tc>
+        <w:tc>
+          <w:tcPr>
+            <w:tcW w:type="dxa" w:w="2000"/>
+            <w:tcMar>
+              <w:top w:type="dxa" w:w="60"/>
+              <w:left w:type="dxa" w:w="80"/>
+              <w:bottom w:type="dxa" w:w="60"/>
+              <w:right w:type="dxa" w:w="80"/>
+            </w:tcMar>
+            <w:vAlign w:val="center"/>
+          </w:tcPr>
+          <w:p>
+            <w:pPr>
+              <w:jc w:val="center"/>
+            </w:pPr>
+            <w:r>
+              <w:rPr>
+                <w:rFonts w:ascii="Calibri" w:cs="Calibri" w:eastAsia="Calibri" w:hAnsi="Calibri"/>
+                <w:b w:val="false"/>
+                <w:bCs w:val="false"/>
+                <w:i w:val="false"/>
+                <w:iCs w:val="false"/>
+                <w:color w:val="000000"/>
+                <w:sz w:val="18"/>
+                <w:szCs w:val="18"/>
+              </w:rPr>
+              <w:t xml:space="preserve">Dr. Okoye</w:t>
+            </w:r>
+          </w:p>
+        </w:tc>
+        <w:tc>
+          <w:tcPr>
+            <w:tcW w:type="dxa" w:w="2000"/>
+            <w:tcMar>
+              <w:top w:type="dxa" w:w="60"/>
+              <w:left w:type="dxa" w:w="80"/>
+              <w:bottom w:type="dxa" w:w="60"/>
+              <w:right w:type="dxa" w:w="80"/>
+            </w:tcMar>
+            <w:vAlign w:val="center"/>
+          </w:tcPr>
+          <w:p>
+            <w:pPr>
+              <w:jc w:val="center"/>
+            </w:pPr>
+            <w:r>
+              <w:rPr>
+                <w:rFonts w:ascii="Calibri" w:cs="Calibri" w:eastAsia="Calibri" w:hAnsi="Calibri"/>
+                <w:b w:val="false"/>
+                <w:bCs w:val="false"/>
+                <w:i w:val="false"/>
+                <w:iCs w:val="false"/>
+                <w:color w:val="000000"/>
+                <w:sz w:val="18"/>
+                <w:szCs w:val="18"/>
+              </w:rPr>
+              <w:t xml:space="preserve">Dr. Ruzhynsky ★</w:t>
+            </w:r>
+          </w:p>
+        </w:tc>
+        <w:tc>
+          <w:tcPr>
+            <w:tcW w:type="dxa" w:w="2000"/>
+            <w:tcMar>
+              <w:top w:type="dxa" w:w="60"/>
+              <w:left w:type="dxa" w:w="80"/>
+              <w:bottom w:type="dxa" w:w="60"/>
+              <w:right w:type="dxa" w:w="80"/>
+            </w:tcMar>
+            <w:vAlign w:val="center"/>
+          </w:tcPr>
+          <w:p>
+            <w:pPr>
+              <w:jc w:val="center"/>
+            </w:pPr>
+            <w:r>
+              <w:rPr>
+                <w:rFonts w:ascii="Calibri" w:cs="Calibri" w:eastAsia="Calibri" w:hAnsi="Calibri"/>
+                <w:b w:val="false"/>
+                <w:bCs w:val="false"/>
+                <w:i/>
+                <w:iCs/>
+                <w:color w:val="666666"/>
+                <w:sz w:val="16"/>
+                <w:szCs w:val="16"/>
+              </w:rPr>
+              <w:t xml:space="preserve">(covered by full week)</w:t>
+            </w:r>
+          </w:p>
+        </w:tc>
+        <w:tc>
+          <w:tcPr>
+            <w:tcW w:type="dxa" w:w="2000"/>
+            <w:tcMar>
+              <w:top w:type="dxa" w:w="60"/>
+              <w:left w:type="dxa" w:w="80"/>
+              <w:bottom w:type="dxa" w:w="60"/>
+              <w:right w:type="dxa" w:w="80"/>
+            </w:tcMar>
+            <w:vAlign w:val="center"/>
+          </w:tcPr>
+          <w:p>
+            <w:pPr>
+              <w:jc w:val="center"/>
+            </w:pPr>
+            <w:r>
+              <w:rPr>
+                <w:rFonts w:ascii="Calibri" w:cs="Calibri" w:eastAsia="Calibri" w:hAnsi="Calibri"/>
+                <w:b w:val="false"/>
+                <w:bCs w:val="false"/>
+                <w:i/>
+                <w:iCs/>
+                <w:color w:val="666666"/>
+                <w:sz w:val="16"/>
+                <w:szCs w:val="16"/>
+              </w:rPr>
+              <w:t xml:space="preserve">(covered by full week)</w:t>
+            </w:r>
+          </w:p>
+        </w:tc>
+      </w:tr>
+      <w:tr>
+        <w:tc>
+          <w:tcPr>
+            <w:tcW w:type="dxa" w:w="2400"/>
+            <w:tcMar>
+              <w:top w:type="dxa" w:w="60"/>
+              <w:left w:type="dxa" w:w="80"/>
+              <w:bottom w:type="dxa" w:w="60"/>
+              <w:right w:type="dxa" w:w="80"/>
+            </w:tcMar>
+            <w:vAlign w:val="center"/>
+          </w:tcPr>
+          <w:p>
+            <w:pPr>
+              <w:jc w:val="center"/>
+            </w:pPr>
+            <w:r>
+              <w:rPr>
+                <w:rFonts w:ascii="Calibri" w:cs="Calibri" w:eastAsia="Calibri" w:hAnsi="Calibri"/>
+                <w:b/>
+                <w:bCs/>
+                <w:sz w:val="18"/>
+                <w:szCs w:val="18"/>
+              </w:rPr>
+              <w:t xml:space="preserve">Week 5</w:t>
+            </w:r>
+          </w:p>
+          <w:p>
+            <w:pPr>
+              <w:jc w:val="center"/>
+            </w:pPr>
+            <w:r>
+              <w:rPr>
+                <w:rFonts w:ascii="Calibri" w:cs="Calibri" w:eastAsia="Calibri" w:hAnsi="Calibri"/>
+                <w:color w:val="666666"/>
+                <w:sz w:val="16"/>
+                <w:szCs w:val="16"/>
+              </w:rPr>
+              <w:t xml:space="preserve">Sep 28 – Oct 4</w:t>
+            </w:r>
+          </w:p>
+        </w:tc>
+        <w:tc>
+          <w:tcPr>
+            <w:tcW w:type="dxa" w:w="2000"/>
+            <w:tcMar>
+              <w:top w:type="dxa" w:w="60"/>
+              <w:left w:type="dxa" w:w="80"/>
+              <w:bottom w:type="dxa" w:w="60"/>
+              <w:right w:type="dxa" w:w="80"/>
+            </w:tcMar>
+            <w:vAlign w:val="center"/>
+          </w:tcPr>
+          <w:p>
+            <w:pPr>
+              <w:jc w:val="center"/>
+            </w:pPr>
+            <w:r>
+              <w:rPr>
+                <w:rFonts w:ascii="Calibri" w:cs="Calibri" w:eastAsia="Calibri" w:hAnsi="Calibri"/>
+                <w:b w:val="false"/>
+                <w:bCs w:val="false"/>
+                <w:i w:val="false"/>
+                <w:iCs w:val="false"/>
+                <w:color w:val="000000"/>
+                <w:sz w:val="18"/>
+                <w:szCs w:val="18"/>
+              </w:rPr>
+              <w:t xml:space="preserve">Dr. Gill ★</w:t>
+            </w:r>
+          </w:p>
+        </w:tc>
+        <w:tc>
+          <w:tcPr>
+            <w:tcW w:type="dxa" w:w="2000"/>
+            <w:tcMar>
+              <w:top w:type="dxa" w:w="60"/>
+              <w:left w:type="dxa" w:w="80"/>
+              <w:bottom w:type="dxa" w:w="60"/>
+              <w:right w:type="dxa" w:w="80"/>
+            </w:tcMar>
+            <w:vAlign w:val="center"/>
+          </w:tcPr>
+          <w:p>
+            <w:pPr>
+              <w:jc w:val="center"/>
+            </w:pPr>
+            <w:r>
+              <w:rPr>
+                <w:rFonts w:ascii="Calibri" w:cs="Calibri" w:eastAsia="Calibri" w:hAnsi="Calibri"/>
+                <w:b w:val="false"/>
+                <w:bCs w:val="false"/>
+                <w:i/>
+                <w:iCs/>
+                <w:color w:val="666666"/>
+                <w:sz w:val="16"/>
+                <w:szCs w:val="16"/>
+              </w:rPr>
+              <w:t xml:space="preserve">(covered by full week)</w:t>
+            </w:r>
+          </w:p>
+        </w:tc>
+        <w:tc>
+          <w:tcPr>
+            <w:tcW w:type="dxa" w:w="2000"/>
+            <w:tcMar>
+              <w:top w:type="dxa" w:w="60"/>
+              <w:left w:type="dxa" w:w="80"/>
+              <w:bottom w:type="dxa" w:w="60"/>
+              <w:right w:type="dxa" w:w="80"/>
+            </w:tcMar>
+            <w:vAlign w:val="center"/>
+          </w:tcPr>
+          <w:p>
+            <w:pPr>
+              <w:jc w:val="center"/>
+            </w:pPr>
+            <w:r>
+              <w:rPr>
+                <w:rFonts w:ascii="Calibri" w:cs="Calibri" w:eastAsia="Calibri" w:hAnsi="Calibri"/>
+                <w:b w:val="false"/>
+                <w:bCs w:val="false"/>
+                <w:i/>
+                <w:iCs/>
+                <w:color w:val="666666"/>
+                <w:sz w:val="16"/>
+                <w:szCs w:val="16"/>
+              </w:rPr>
+              <w:t xml:space="preserve">(covered by full week)</w:t>
+            </w:r>
+          </w:p>
+        </w:tc>
+        <w:tc>
+          <w:tcPr>
+            <w:tcW w:type="dxa" w:w="2000"/>
+            <w:tcMar>
+              <w:top w:type="dxa" w:w="60"/>
+              <w:left w:type="dxa" w:w="80"/>
+              <w:bottom w:type="dxa" w:w="60"/>
+              <w:right w:type="dxa" w:w="80"/>
+            </w:tcMar>
+            <w:vAlign w:val="center"/>
+          </w:tcPr>
+          <w:p>
+            <w:pPr>
+              <w:jc w:val="center"/>
+            </w:pPr>
+            <w:r>
+              <w:rPr>
+                <w:rFonts w:ascii="Calibri" w:cs="Calibri" w:eastAsia="Calibri" w:hAnsi="Calibri"/>
+                <w:b w:val="false"/>
+                <w:bCs w:val="false"/>
+                <w:i w:val="false"/>
+                <w:iCs w:val="false"/>
+                <w:color w:val="000000"/>
+                <w:sz w:val="18"/>
+                <w:szCs w:val="18"/>
+              </w:rPr>
+              <w:t xml:space="preserve">Dr. Classen ★</w:t>
+            </w:r>
+          </w:p>
+        </w:tc>
+        <w:tc>
+          <w:tcPr>
+            <w:tcW w:type="dxa" w:w="2000"/>
+            <w:tcMar>
+              <w:top w:type="dxa" w:w="60"/>
+              <w:left w:type="dxa" w:w="80"/>
+              <w:bottom w:type="dxa" w:w="60"/>
+              <w:right w:type="dxa" w:w="80"/>
+            </w:tcMar>
+            <w:vAlign w:val="center"/>
+          </w:tcPr>
+          <w:p>
+            <w:pPr>
+              <w:jc w:val="center"/>
+            </w:pPr>
+            <w:r>
+              <w:rPr>
+                <w:rFonts w:ascii="Calibri" w:cs="Calibri" w:eastAsia="Calibri" w:hAnsi="Calibri"/>
+                <w:b w:val="false"/>
+                <w:bCs w:val="false"/>
+                <w:i/>
+                <w:iCs/>
+                <w:color w:val="666666"/>
+                <w:sz w:val="16"/>
+                <w:szCs w:val="16"/>
+              </w:rPr>
+              <w:t xml:space="preserve">(covered by full week)</w:t>
+            </w:r>
+          </w:p>
+        </w:tc>
+        <w:tc>
+          <w:tcPr>
+            <w:tcW w:type="dxa" w:w="2000"/>
+            <w:tcMar>
+              <w:top w:type="dxa" w:w="60"/>
+              <w:left w:type="dxa" w:w="80"/>
+              <w:bottom w:type="dxa" w:w="60"/>
+              <w:right w:type="dxa" w:w="80"/>
+            </w:tcMar>
+            <w:vAlign w:val="center"/>
+          </w:tcPr>
+          <w:p>
+            <w:pPr>
+              <w:jc w:val="center"/>
+            </w:pPr>
+            <w:r>
+              <w:rPr>
+                <w:rFonts w:ascii="Calibri" w:cs="Calibri" w:eastAsia="Calibri" w:hAnsi="Calibri"/>
+                <w:b w:val="false"/>
+                <w:bCs w:val="false"/>
+                <w:i/>
+                <w:iCs/>
+                <w:color w:val="666666"/>
+                <w:sz w:val="16"/>
+                <w:szCs w:val="16"/>
+              </w:rPr>
+              <w:t xml:space="preserve">(covered by full week)</w:t>
+            </w:r>
+          </w:p>
+        </w:tc>
+      </w:tr>
+      <w:tr>
+        <w:tc>
+          <w:tcPr>
+            <w:tcW w:type="dxa" w:w="2400"/>
+            <w:tcMar>
+              <w:top w:type="dxa" w:w="60"/>
+              <w:left w:type="dxa" w:w="80"/>
+              <w:bottom w:type="dxa" w:w="60"/>
+              <w:right w:type="dxa" w:w="80"/>
+            </w:tcMar>
+            <w:vAlign w:val="center"/>
+          </w:tcPr>
+          <w:p>
+            <w:pPr>
+              <w:jc w:val="center"/>
+            </w:pPr>
+            <w:r>
+              <w:rPr>
+                <w:rFonts w:ascii="Calibri" w:cs="Calibri" w:eastAsia="Calibri" w:hAnsi="Calibri"/>
+                <w:b/>
+                <w:bCs/>
+                <w:sz w:val="18"/>
+                <w:szCs w:val="18"/>
+              </w:rPr>
+              <w:t xml:space="preserve">Week 6</w:t>
+            </w:r>
+          </w:p>
+          <w:p>
+            <w:pPr>
+              <w:jc w:val="center"/>
+            </w:pPr>
+            <w:r>
+              <w:rPr>
+                <w:rFonts w:ascii="Calibri" w:cs="Calibri" w:eastAsia="Calibri" w:hAnsi="Calibri"/>
+                <w:color w:val="666666"/>
+                <w:sz w:val="16"/>
+                <w:szCs w:val="16"/>
+              </w:rPr>
+              <w:t xml:space="preserve">Oct 5 – Oct 11</w:t>
+            </w:r>
+          </w:p>
+        </w:tc>
+        <w:tc>
+          <w:tcPr>
+            <w:tcW w:type="dxa" w:w="2000"/>
+            <w:tcMar>
+              <w:top w:type="dxa" w:w="60"/>
+              <w:left w:type="dxa" w:w="80"/>
+              <w:bottom w:type="dxa" w:w="60"/>
+              <w:right w:type="dxa" w:w="80"/>
+            </w:tcMar>
+            <w:vAlign w:val="center"/>
+          </w:tcPr>
+          <w:p>
+            <w:pPr>
+              <w:jc w:val="center"/>
+            </w:pPr>
+            <w:r>
+              <w:rPr>
+                <w:rFonts w:ascii="Calibri" w:cs="Calibri" w:eastAsia="Calibri" w:hAnsi="Calibri"/>
+                <w:b w:val="false"/>
+                <w:bCs w:val="false"/>
+                <w:i w:val="false"/>
+                <w:iCs w:val="false"/>
+                <w:color w:val="000000"/>
+                <w:sz w:val="18"/>
+                <w:szCs w:val="18"/>
+              </w:rPr>
+              <w:t xml:space="preserve">Dr. Sawich ★</w:t>
+            </w:r>
+          </w:p>
+        </w:tc>
+        <w:tc>
+          <w:tcPr>
+            <w:tcW w:type="dxa" w:w="2000"/>
+            <w:tcMar>
+              <w:top w:type="dxa" w:w="60"/>
+              <w:left w:type="dxa" w:w="80"/>
+              <w:bottom w:type="dxa" w:w="60"/>
+              <w:right w:type="dxa" w:w="80"/>
+            </w:tcMar>
+            <w:vAlign w:val="center"/>
+          </w:tcPr>
+          <w:p>
+            <w:pPr>
+              <w:jc w:val="center"/>
+            </w:pPr>
+            <w:r>
+              <w:rPr>
+                <w:rFonts w:ascii="Calibri" w:cs="Calibri" w:eastAsia="Calibri" w:hAnsi="Calibri"/>
+                <w:b w:val="false"/>
+                <w:bCs w:val="false"/>
+                <w:i/>
+                <w:iCs/>
+                <w:color w:val="666666"/>
+                <w:sz w:val="16"/>
+                <w:szCs w:val="16"/>
+              </w:rPr>
+              <w:t xml:space="preserve">(covered by full week)</w:t>
+            </w:r>
+          </w:p>
+        </w:tc>
+        <w:tc>
+          <w:tcPr>
+            <w:tcW w:type="dxa" w:w="2000"/>
+            <w:tcMar>
+              <w:top w:type="dxa" w:w="60"/>
+              <w:left w:type="dxa" w:w="80"/>
+              <w:bottom w:type="dxa" w:w="60"/>
+              <w:right w:type="dxa" w:w="80"/>
+            </w:tcMar>
+            <w:vAlign w:val="center"/>
+          </w:tcPr>
+          <w:p>
+            <w:pPr>
+              <w:jc w:val="center"/>
+            </w:pPr>
+            <w:r>
+              <w:rPr>
+                <w:rFonts w:ascii="Calibri" w:cs="Calibri" w:eastAsia="Calibri" w:hAnsi="Calibri"/>
+                <w:b w:val="false"/>
+                <w:bCs w:val="false"/>
+                <w:i/>
+                <w:iCs/>
+                <w:color w:val="666666"/>
+                <w:sz w:val="16"/>
+                <w:szCs w:val="16"/>
+              </w:rPr>
+              <w:t xml:space="preserve">(covered by full week)</w:t>
+            </w:r>
+          </w:p>
+        </w:tc>
+        <w:tc>
+          <w:tcPr>
+            <w:tcW w:type="dxa" w:w="2000"/>
+            <w:tcMar>
+              <w:top w:type="dxa" w:w="60"/>
+              <w:left w:type="dxa" w:w="80"/>
+              <w:bottom w:type="dxa" w:w="60"/>
+              <w:right w:type="dxa" w:w="80"/>
+            </w:tcMar>
+            <w:vAlign w:val="center"/>
+          </w:tcPr>
+          <w:p>
+            <w:pPr>
+              <w:jc w:val="center"/>
+            </w:pPr>
+            <w:r>
+              <w:rPr>
+                <w:rFonts w:ascii="Calibri" w:cs="Calibri" w:eastAsia="Calibri" w:hAnsi="Calibri"/>
+                <w:b w:val="false"/>
+                <w:bCs w:val="false"/>
+                <w:i w:val="false"/>
+                <w:iCs w:val="false"/>
+                <w:color w:val="000000"/>
+                <w:sz w:val="18"/>
+                <w:szCs w:val="18"/>
+              </w:rPr>
+              <w:t xml:space="preserve">Dr. Palay ★</w:t>
+            </w:r>
+          </w:p>
+        </w:tc>
+        <w:tc>
+          <w:tcPr>
+            <w:tcW w:type="dxa" w:w="2000"/>
+            <w:tcMar>
+              <w:top w:type="dxa" w:w="60"/>
+              <w:left w:type="dxa" w:w="80"/>
+              <w:bottom w:type="dxa" w:w="60"/>
+              <w:right w:type="dxa" w:w="80"/>
+            </w:tcMar>
+            <w:vAlign w:val="center"/>
+          </w:tcPr>
+          <w:p>
+            <w:pPr>
+              <w:jc w:val="center"/>
+            </w:pPr>
+            <w:r>
+              <w:rPr>
+                <w:rFonts w:ascii="Calibri" w:cs="Calibri" w:eastAsia="Calibri" w:hAnsi="Calibri"/>
+                <w:b w:val="false"/>
+                <w:bCs w:val="false"/>
+                <w:i/>
+                <w:iCs/>
+                <w:color w:val="666666"/>
+                <w:sz w:val="16"/>
+                <w:szCs w:val="16"/>
+              </w:rPr>
+              <w:t xml:space="preserve">(covered by full week)</w:t>
+            </w:r>
+          </w:p>
+        </w:tc>
+        <w:tc>
+          <w:tcPr>
+            <w:tcW w:type="dxa" w:w="2000"/>
+            <w:tcMar>
+              <w:top w:type="dxa" w:w="60"/>
+              <w:left w:type="dxa" w:w="80"/>
+              <w:bottom w:type="dxa" w:w="60"/>
+              <w:right w:type="dxa" w:w="80"/>
+            </w:tcMar>
+            <w:vAlign w:val="center"/>
+          </w:tcPr>
+          <w:p>
+            <w:pPr>
+              <w:jc w:val="center"/>
+            </w:pPr>
+            <w:r>
+              <w:rPr>
+                <w:rFonts w:ascii="Calibri" w:cs="Calibri" w:eastAsia="Calibri" w:hAnsi="Calibri"/>
+                <w:b w:val="false"/>
+                <w:bCs w:val="false"/>
+                <w:i/>
+                <w:iCs/>
+                <w:color w:val="666666"/>
+                <w:sz w:val="16"/>
+                <w:szCs w:val="16"/>
+              </w:rPr>
+              <w:t xml:space="preserve">(covered by full week)</w:t>
+            </w:r>
+          </w:p>
+        </w:tc>
+      </w:tr>
+      <w:tr>
+        <w:tc>
+          <w:tcPr>
+            <w:tcW w:type="dxa" w:w="2400"/>
+            <w:tcMar>
+              <w:top w:type="dxa" w:w="60"/>
+              <w:left w:type="dxa" w:w="80"/>
+              <w:bottom w:type="dxa" w:w="60"/>
+              <w:right w:type="dxa" w:w="80"/>
+            </w:tcMar>
+            <w:vAlign w:val="center"/>
+          </w:tcPr>
+          <w:p>
+            <w:pPr>
+              <w:jc w:val="center"/>
+            </w:pPr>
+            <w:r>
+              <w:rPr>
+                <w:rFonts w:ascii="Calibri" w:cs="Calibri" w:eastAsia="Calibri" w:hAnsi="Calibri"/>
+                <w:b/>
+                <w:bCs/>
+                <w:sz w:val="18"/>
+                <w:szCs w:val="18"/>
+              </w:rPr>
+              <w:t xml:space="preserve">Week 7</w:t>
+            </w:r>
+          </w:p>
+          <w:p>
+            <w:pPr>
+              <w:jc w:val="center"/>
+            </w:pPr>
+            <w:r>
+              <w:rPr>
+                <w:rFonts w:ascii="Calibri" w:cs="Calibri" w:eastAsia="Calibri" w:hAnsi="Calibri"/>
+                <w:color w:val="666666"/>
+                <w:sz w:val="16"/>
+                <w:szCs w:val="16"/>
+              </w:rPr>
+              <w:t xml:space="preserve">Oct 12 – Oct 18</w:t>
+            </w:r>
+          </w:p>
+        </w:tc>
+        <w:tc>
+          <w:tcPr>
+            <w:tcW w:type="dxa" w:w="2000"/>
+            <w:tcMar>
+              <w:top w:type="dxa" w:w="60"/>
+              <w:left w:type="dxa" w:w="80"/>
+              <w:bottom w:type="dxa" w:w="60"/>
+              <w:right w:type="dxa" w:w="80"/>
+            </w:tcMar>
+            <w:vAlign w:val="center"/>
+          </w:tcPr>
+          <w:p>
+            <w:pPr>
+              <w:jc w:val="center"/>
+            </w:pPr>
+            <w:r>
+              <w:rPr>
+                <w:rFonts w:ascii="Calibri" w:cs="Calibri" w:eastAsia="Calibri" w:hAnsi="Calibri"/>
+                <w:b w:val="false"/>
+                <w:bCs w:val="false"/>
+                <w:i w:val="false"/>
+                <w:iCs w:val="false"/>
+                <w:color w:val="000000"/>
+                <w:sz w:val="18"/>
+                <w:szCs w:val="18"/>
+              </w:rPr>
+              <w:t xml:space="preserve">Dr. Kuzenko</w:t>
+            </w:r>
+          </w:p>
+        </w:tc>
+        <w:tc>
+          <w:tcPr>
+            <w:tcW w:type="dxa" w:w="2000"/>
+            <w:tcMar>
+              <w:top w:type="dxa" w:w="60"/>
+              <w:left w:type="dxa" w:w="80"/>
+              <w:bottom w:type="dxa" w:w="60"/>
+              <w:right w:type="dxa" w:w="80"/>
+            </w:tcMar>
+            <w:vAlign w:val="center"/>
+          </w:tcPr>
+          <w:p>
+            <w:pPr>
+              <w:jc w:val="center"/>
+            </w:pPr>
+            <w:r>
+              <w:rPr>
+                <w:rFonts w:ascii="Calibri" w:cs="Calibri" w:eastAsia="Calibri" w:hAnsi="Calibri"/>
+                <w:b w:val="false"/>
+                <w:bCs w:val="false"/>
+                <w:i/>
+                <w:iCs/>
+                <w:color w:val="666666"/>
+                <w:sz w:val="16"/>
+                <w:szCs w:val="16"/>
+              </w:rPr>
+              <w:t xml:space="preserve">(covered by full week)</w:t>
+            </w:r>
+          </w:p>
+        </w:tc>
+        <w:tc>
+          <w:tcPr>
+            <w:tcW w:type="dxa" w:w="2000"/>
+            <w:tcMar>
+              <w:top w:type="dxa" w:w="60"/>
+              <w:left w:type="dxa" w:w="80"/>
+              <w:bottom w:type="dxa" w:w="60"/>
+              <w:right w:type="dxa" w:w="80"/>
+            </w:tcMar>
+            <w:vAlign w:val="center"/>
+          </w:tcPr>
+          <w:p>
+            <w:pPr>
+              <w:jc w:val="center"/>
+            </w:pPr>
+            <w:r>
+              <w:rPr>
+                <w:rFonts w:ascii="Calibri" w:cs="Calibri" w:eastAsia="Calibri" w:hAnsi="Calibri"/>
+                <w:b w:val="false"/>
+                <w:bCs w:val="false"/>
+                <w:i/>
+                <w:iCs/>
+                <w:color w:val="666666"/>
+                <w:sz w:val="16"/>
+                <w:szCs w:val="16"/>
+              </w:rPr>
+              <w:t xml:space="preserve">(covered by full week)</w:t>
+            </w:r>
+          </w:p>
+        </w:tc>
+        <w:tc>
+          <w:tcPr>
+            <w:tcW w:type="dxa" w:w="2000"/>
+            <w:tcMar>
+              <w:top w:type="dxa" w:w="60"/>
+              <w:left w:type="dxa" w:w="80"/>
+              <w:bottom w:type="dxa" w:w="60"/>
+              <w:right w:type="dxa" w:w="80"/>
+            </w:tcMar>
+            <w:vAlign w:val="center"/>
+          </w:tcPr>
+          <w:p>
+            <w:pPr>
+              <w:jc w:val="center"/>
+            </w:pPr>
+            <w:r>
+              <w:rPr>
+                <w:rFonts w:ascii="Calibri" w:cs="Calibri" w:eastAsia="Calibri" w:hAnsi="Calibri"/>
+                <w:b w:val="false"/>
+                <w:bCs w:val="false"/>
+                <w:i w:val="false"/>
+                <w:iCs w:val="false"/>
+                <w:color w:val="000000"/>
+                <w:sz w:val="18"/>
+                <w:szCs w:val="18"/>
+              </w:rPr>
+              <w:t xml:space="preserve">Dr. Ruzhynsky</w:t>
+            </w:r>
+          </w:p>
+        </w:tc>
+        <w:tc>
+          <w:tcPr>
+            <w:tcW w:type="dxa" w:w="2000"/>
+            <w:tcMar>
+              <w:top w:type="dxa" w:w="60"/>
+              <w:left w:type="dxa" w:w="80"/>
+              <w:bottom w:type="dxa" w:w="60"/>
+              <w:right w:type="dxa" w:w="80"/>
+            </w:tcMar>
+            <w:vAlign w:val="center"/>
+          </w:tcPr>
+          <w:p>
+            <w:pPr>
+              <w:jc w:val="center"/>
+            </w:pPr>
+            <w:r>
+              <w:rPr>
+                <w:rFonts w:ascii="Calibri" w:cs="Calibri" w:eastAsia="Calibri" w:hAnsi="Calibri"/>
+                <w:b w:val="false"/>
+                <w:bCs w:val="false"/>
+                <w:i/>
+                <w:iCs/>
+                <w:color w:val="666666"/>
+                <w:sz w:val="16"/>
+                <w:szCs w:val="16"/>
+              </w:rPr>
+              <w:t xml:space="preserve">(covered by full week)</w:t>
+            </w:r>
+          </w:p>
+        </w:tc>
+        <w:tc>
+          <w:tcPr>
+            <w:tcW w:type="dxa" w:w="2000"/>
+            <w:tcMar>
+              <w:top w:type="dxa" w:w="60"/>
+              <w:left w:type="dxa" w:w="80"/>
+              <w:bottom w:type="dxa" w:w="60"/>
+              <w:right w:type="dxa" w:w="80"/>
+            </w:tcMar>
+            <w:vAlign w:val="center"/>
+          </w:tcPr>
+          <w:p>
+            <w:pPr>
+              <w:jc w:val="center"/>
+            </w:pPr>
+            <w:r>
+              <w:rPr>
+                <w:rFonts w:ascii="Calibri" w:cs="Calibri" w:eastAsia="Calibri" w:hAnsi="Calibri"/>
+                <w:b w:val="false"/>
+                <w:bCs w:val="false"/>
+                <w:i/>
+                <w:iCs/>
+                <w:color w:val="666666"/>
+                <w:sz w:val="16"/>
+                <w:szCs w:val="16"/>
+              </w:rPr>
+              <w:t xml:space="preserve">(covered by full week)</w:t>
+            </w:r>
+          </w:p>
+        </w:tc>
+      </w:tr>
+      <w:tr>
+        <w:tc>
+          <w:tcPr>
+            <w:tcW w:type="dxa" w:w="2400"/>
+            <w:tcMar>
+              <w:top w:type="dxa" w:w="60"/>
+              <w:left w:type="dxa" w:w="80"/>
+              <w:bottom w:type="dxa" w:w="60"/>
+              <w:right w:type="dxa" w:w="80"/>
+            </w:tcMar>
+            <w:vAlign w:val="center"/>
+          </w:tcPr>
+          <w:p>
+            <w:pPr>
+              <w:jc w:val="center"/>
+            </w:pPr>
+            <w:r>
+              <w:rPr>
+                <w:rFonts w:ascii="Calibri" w:cs="Calibri" w:eastAsia="Calibri" w:hAnsi="Calibri"/>
+                <w:b/>
+                <w:bCs/>
+                <w:sz w:val="18"/>
+                <w:szCs w:val="18"/>
+              </w:rPr>
+              <w:t xml:space="preserve">Week 8</w:t>
+            </w:r>
+          </w:p>
+          <w:p>
+            <w:pPr>
+              <w:jc w:val="center"/>
+            </w:pPr>
+            <w:r>
+              <w:rPr>
+                <w:rFonts w:ascii="Calibri" w:cs="Calibri" w:eastAsia="Calibri" w:hAnsi="Calibri"/>
+                <w:color w:val="666666"/>
+                <w:sz w:val="16"/>
+                <w:szCs w:val="16"/>
+              </w:rPr>
+              <w:t xml:space="preserve">Oct 19 – Oct 25</w:t>
+            </w:r>
+          </w:p>
+        </w:tc>
+        <w:tc>
+          <w:tcPr>
+            <w:tcW w:type="dxa" w:w="2000"/>
+            <w:tcMar>
+              <w:top w:type="dxa" w:w="60"/>
+              <w:left w:type="dxa" w:w="80"/>
+              <w:bottom w:type="dxa" w:w="60"/>
+              <w:right w:type="dxa" w:w="80"/>
+            </w:tcMar>
+            <w:vAlign w:val="center"/>
+          </w:tcPr>
+          <w:p>
+            <w:pPr>
+              <w:jc w:val="center"/>
+            </w:pPr>
+            <w:r>
+              <w:rPr>
+                <w:rFonts w:ascii="Calibri" w:cs="Calibri" w:eastAsia="Calibri" w:hAnsi="Calibri"/>
+                <w:b w:val="false"/>
+                <w:bCs w:val="false"/>
+                <w:i w:val="false"/>
+                <w:iCs w:val="false"/>
+                <w:color w:val="000000"/>
+                <w:sz w:val="18"/>
+                <w:szCs w:val="18"/>
+              </w:rPr>
+              <w:t xml:space="preserve">Dr. Konrad</w:t>
+            </w:r>
+          </w:p>
+        </w:tc>
+        <w:tc>
+          <w:tcPr>
+            <w:tcW w:type="dxa" w:w="2000"/>
+            <w:tcMar>
+              <w:top w:type="dxa" w:w="60"/>
+              <w:left w:type="dxa" w:w="80"/>
+              <w:bottom w:type="dxa" w:w="60"/>
+              <w:right w:type="dxa" w:w="80"/>
+            </w:tcMar>
+            <w:vAlign w:val="center"/>
+          </w:tcPr>
+          <w:p>
+            <w:pPr>
+              <w:jc w:val="center"/>
+            </w:pPr>
+            <w:r>
+              <w:rPr>
+                <w:rFonts w:ascii="Calibri" w:cs="Calibri" w:eastAsia="Calibri" w:hAnsi="Calibri"/>
+                <w:b w:val="false"/>
+                <w:bCs w:val="false"/>
+                <w:i/>
+                <w:iCs/>
+                <w:color w:val="666666"/>
+                <w:sz w:val="16"/>
+                <w:szCs w:val="16"/>
+              </w:rPr>
+              <w:t xml:space="preserve">(covered by full week)</w:t>
+            </w:r>
+          </w:p>
+        </w:tc>
+        <w:tc>
+          <w:tcPr>
+            <w:tcW w:type="dxa" w:w="2000"/>
+            <w:tcMar>
+              <w:top w:type="dxa" w:w="60"/>
+              <w:left w:type="dxa" w:w="80"/>
+              <w:bottom w:type="dxa" w:w="60"/>
+              <w:right w:type="dxa" w:w="80"/>
+            </w:tcMar>
+            <w:vAlign w:val="center"/>
+          </w:tcPr>
+          <w:p>
+            <w:pPr>
+              <w:jc w:val="center"/>
+            </w:pPr>
+            <w:r>
+              <w:rPr>
+                <w:rFonts w:ascii="Calibri" w:cs="Calibri" w:eastAsia="Calibri" w:hAnsi="Calibri"/>
+                <w:b w:val="false"/>
+                <w:bCs w:val="false"/>
+                <w:i/>
+                <w:iCs/>
+                <w:color w:val="666666"/>
+                <w:sz w:val="16"/>
+                <w:szCs w:val="16"/>
+              </w:rPr>
+              <w:t xml:space="preserve">(covered by full week)</w:t>
+            </w:r>
+          </w:p>
+        </w:tc>
+        <w:tc>
+          <w:tcPr>
+            <w:tcW w:type="dxa" w:w="2000"/>
+            <w:tcMar>
+              <w:top w:type="dxa" w:w="60"/>
+              <w:left w:type="dxa" w:w="80"/>
+              <w:bottom w:type="dxa" w:w="60"/>
+              <w:right w:type="dxa" w:w="80"/>
+            </w:tcMar>
+            <w:vAlign w:val="center"/>
+          </w:tcPr>
+          <w:p>
+            <w:pPr>
+              <w:jc w:val="center"/>
+            </w:pPr>
+            <w:r>
+              <w:rPr>
+                <w:rFonts w:ascii="Calibri" w:cs="Calibri" w:eastAsia="Calibri" w:hAnsi="Calibri"/>
+                <w:b w:val="false"/>
+                <w:bCs w:val="false"/>
+                <w:i w:val="false"/>
+                <w:iCs w:val="false"/>
+                <w:color w:val="000000"/>
+                <w:sz w:val="18"/>
+                <w:szCs w:val="18"/>
+              </w:rPr>
+              <w:t xml:space="preserve">Dr. Okoye</w:t>
+            </w:r>
+          </w:p>
+        </w:tc>
+        <w:tc>
+          <w:tcPr>
+            <w:tcW w:type="dxa" w:w="2000"/>
+            <w:tcMar>
+              <w:top w:type="dxa" w:w="60"/>
+              <w:left w:type="dxa" w:w="80"/>
+              <w:bottom w:type="dxa" w:w="60"/>
+              <w:right w:type="dxa" w:w="80"/>
+            </w:tcMar>
+            <w:vAlign w:val="center"/>
+          </w:tcPr>
+          <w:p>
+            <w:pPr>
+              <w:jc w:val="center"/>
+            </w:pPr>
+            <w:r>
+              <w:rPr>
+                <w:rFonts w:ascii="Calibri" w:cs="Calibri" w:eastAsia="Calibri" w:hAnsi="Calibri"/>
+                <w:b w:val="false"/>
+                <w:bCs w:val="false"/>
+                <w:i/>
+                <w:iCs/>
+                <w:color w:val="666666"/>
+                <w:sz w:val="16"/>
+                <w:szCs w:val="16"/>
+              </w:rPr>
+              <w:t xml:space="preserve">(covered by full week)</w:t>
+            </w:r>
+          </w:p>
+        </w:tc>
+        <w:tc>
+          <w:tcPr>
+            <w:tcW w:type="dxa" w:w="2000"/>
+            <w:tcMar>
+              <w:top w:type="dxa" w:w="60"/>
+              <w:left w:type="dxa" w:w="80"/>
+              <w:bottom w:type="dxa" w:w="60"/>
+              <w:right w:type="dxa" w:w="80"/>
+            </w:tcMar>
+            <w:vAlign w:val="center"/>
+          </w:tcPr>
+          <w:p>
+            <w:pPr>
+              <w:jc w:val="center"/>
+            </w:pPr>
+            <w:r>
+              <w:rPr>
+                <w:rFonts w:ascii="Calibri" w:cs="Calibri" w:eastAsia="Calibri" w:hAnsi="Calibri"/>
+                <w:b w:val="false"/>
+                <w:bCs w:val="false"/>
+                <w:i/>
+                <w:iCs/>
+                <w:color w:val="666666"/>
+                <w:sz w:val="16"/>
+                <w:szCs w:val="16"/>
+              </w:rPr>
+              <w:t xml:space="preserve">(covered by full week)</w:t>
+            </w:r>
+          </w:p>
+        </w:tc>
+      </w:tr>
+      <w:tr>
+        <w:tc>
+          <w:tcPr>
+            <w:tcW w:type="dxa" w:w="2400"/>
+            <w:tcMar>
+              <w:top w:type="dxa" w:w="60"/>
+              <w:left w:type="dxa" w:w="80"/>
+              <w:bottom w:type="dxa" w:w="60"/>
+              <w:right w:type="dxa" w:w="80"/>
+            </w:tcMar>
+            <w:vAlign w:val="center"/>
+          </w:tcPr>
+          <w:p>
+            <w:pPr>
+              <w:jc w:val="center"/>
+            </w:pPr>
+            <w:r>
+              <w:rPr>
+                <w:rFonts w:ascii="Calibri" w:cs="Calibri" w:eastAsia="Calibri" w:hAnsi="Calibri"/>
+                <w:b/>
+                <w:bCs/>
+                <w:sz w:val="18"/>
+                <w:szCs w:val="18"/>
+              </w:rPr>
+              <w:t xml:space="preserve">Week 9</w:t>
+            </w:r>
+          </w:p>
+          <w:p>
+            <w:pPr>
+              <w:jc w:val="center"/>
+            </w:pPr>
+            <w:r>
+              <w:rPr>
+                <w:rFonts w:ascii="Calibri" w:cs="Calibri" w:eastAsia="Calibri" w:hAnsi="Calibri"/>
+                <w:color w:val="666666"/>
+                <w:sz w:val="16"/>
+                <w:szCs w:val="16"/>
+              </w:rPr>
+              <w:t xml:space="preserve">Oct 26 – Nov 1</w:t>
+            </w:r>
+          </w:p>
+        </w:tc>
+        <w:tc>
+          <w:tcPr>
+            <w:tcW w:type="dxa" w:w="2000"/>
+            <w:tcMar>
+              <w:top w:type="dxa" w:w="60"/>
+              <w:left w:type="dxa" w:w="80"/>
+              <w:bottom w:type="dxa" w:w="60"/>
+              <w:right w:type="dxa" w:w="80"/>
+            </w:tcMar>
+            <w:vAlign w:val="center"/>
+          </w:tcPr>
+          <w:p>
+            <w:pPr>
+              <w:jc w:val="center"/>
+            </w:pPr>
+            <w:r>
+              <w:rPr>
+                <w:rFonts w:ascii="Calibri" w:cs="Calibri" w:eastAsia="Calibri" w:hAnsi="Calibri"/>
+                <w:b w:val="false"/>
+                <w:bCs w:val="false"/>
+                <w:i w:val="false"/>
+                <w:iCs w:val="false"/>
+                <w:color w:val="000000"/>
+                <w:sz w:val="18"/>
+                <w:szCs w:val="18"/>
+              </w:rPr>
+              <w:t xml:space="preserve">Dr. Bolton ★</w:t>
+            </w:r>
+          </w:p>
+        </w:tc>
+        <w:tc>
+          <w:tcPr>
+            <w:tcW w:type="dxa" w:w="2000"/>
+            <w:tcMar>
+              <w:top w:type="dxa" w:w="60"/>
+              <w:left w:type="dxa" w:w="80"/>
+              <w:bottom w:type="dxa" w:w="60"/>
+              <w:right w:type="dxa" w:w="80"/>
+            </w:tcMar>
+            <w:vAlign w:val="center"/>
+          </w:tcPr>
+          <w:p>
+            <w:pPr>
+              <w:jc w:val="center"/>
+            </w:pPr>
+            <w:r>
+              <w:rPr>
+                <w:rFonts w:ascii="Calibri" w:cs="Calibri" w:eastAsia="Calibri" w:hAnsi="Calibri"/>
+                <w:b w:val="false"/>
+                <w:bCs w:val="false"/>
+                <w:i/>
+                <w:iCs/>
+                <w:color w:val="666666"/>
+                <w:sz w:val="16"/>
+                <w:szCs w:val="16"/>
+              </w:rPr>
+              <w:t xml:space="preserve">(covered by full week)</w:t>
+            </w:r>
+          </w:p>
+        </w:tc>
+        <w:tc>
+          <w:tcPr>
+            <w:tcW w:type="dxa" w:w="2000"/>
+            <w:tcMar>
+              <w:top w:type="dxa" w:w="60"/>
+              <w:left w:type="dxa" w:w="80"/>
+              <w:bottom w:type="dxa" w:w="60"/>
+              <w:right w:type="dxa" w:w="80"/>
+            </w:tcMar>
+            <w:vAlign w:val="center"/>
+          </w:tcPr>
+          <w:p>
+            <w:pPr>
+              <w:jc w:val="center"/>
+            </w:pPr>
+            <w:r>
+              <w:rPr>
+                <w:rFonts w:ascii="Calibri" w:cs="Calibri" w:eastAsia="Calibri" w:hAnsi="Calibri"/>
+                <w:b w:val="false"/>
+                <w:bCs w:val="false"/>
+                <w:i/>
+                <w:iCs/>
+                <w:color w:val="666666"/>
+                <w:sz w:val="16"/>
+                <w:szCs w:val="16"/>
+              </w:rPr>
+              <w:t xml:space="preserve">(covered by full week)</w:t>
+            </w:r>
+          </w:p>
+        </w:tc>
+        <w:tc>
+          <w:tcPr>
+            <w:tcW w:type="dxa" w:w="2000"/>
+            <w:tcMar>
+              <w:top w:type="dxa" w:w="60"/>
+              <w:left w:type="dxa" w:w="80"/>
+              <w:bottom w:type="dxa" w:w="60"/>
+              <w:right w:type="dxa" w:w="80"/>
+            </w:tcMar>
+            <w:vAlign w:val="center"/>
+          </w:tcPr>
+          <w:p>
+            <w:pPr>
+              <w:jc w:val="center"/>
+            </w:pPr>
+            <w:r>
+              <w:rPr>
+                <w:rFonts w:ascii="Calibri" w:cs="Calibri" w:eastAsia="Calibri" w:hAnsi="Calibri"/>
+                <w:b w:val="false"/>
+                <w:bCs w:val="false"/>
+                <w:i w:val="false"/>
+                <w:iCs w:val="false"/>
+                <w:color w:val="000000"/>
+                <w:sz w:val="18"/>
+                <w:szCs w:val="18"/>
+              </w:rPr>
+              <w:t xml:space="preserve">Dr. Classen</w:t>
+            </w:r>
+          </w:p>
+        </w:tc>
+        <w:tc>
+          <w:tcPr>
+            <w:tcW w:type="dxa" w:w="2000"/>
+            <w:tcMar>
+              <w:top w:type="dxa" w:w="60"/>
+              <w:left w:type="dxa" w:w="80"/>
+              <w:bottom w:type="dxa" w:w="60"/>
+              <w:right w:type="dxa" w:w="80"/>
+            </w:tcMar>
+            <w:vAlign w:val="center"/>
+          </w:tcPr>
+          <w:p>
+            <w:pPr>
+              <w:jc w:val="center"/>
+            </w:pPr>
+            <w:r>
+              <w:rPr>
+                <w:rFonts w:ascii="Calibri" w:cs="Calibri" w:eastAsia="Calibri" w:hAnsi="Calibri"/>
+                <w:b w:val="false"/>
+                <w:bCs w:val="false"/>
+                <w:i/>
+                <w:iCs/>
+                <w:color w:val="666666"/>
+                <w:sz w:val="16"/>
+                <w:szCs w:val="16"/>
+              </w:rPr>
+              <w:t xml:space="preserve">(covered by full week)</w:t>
+            </w:r>
+          </w:p>
+        </w:tc>
+        <w:tc>
+          <w:tcPr>
+            <w:tcW w:type="dxa" w:w="2000"/>
+            <w:tcMar>
+              <w:top w:type="dxa" w:w="60"/>
+              <w:left w:type="dxa" w:w="80"/>
+              <w:bottom w:type="dxa" w:w="60"/>
+              <w:right w:type="dxa" w:w="80"/>
+            </w:tcMar>
+            <w:vAlign w:val="center"/>
+          </w:tcPr>
+          <w:p>
+            <w:pPr>
+              <w:jc w:val="center"/>
+            </w:pPr>
+            <w:r>
+              <w:rPr>
+                <w:rFonts w:ascii="Calibri" w:cs="Calibri" w:eastAsia="Calibri" w:hAnsi="Calibri"/>
+                <w:b w:val="false"/>
+                <w:bCs w:val="false"/>
+                <w:i/>
+                <w:iCs/>
+                <w:color w:val="666666"/>
+                <w:sz w:val="16"/>
+                <w:szCs w:val="16"/>
+              </w:rPr>
+              <w:t xml:space="preserve">(covered by full week)</w:t>
+            </w:r>
+          </w:p>
+        </w:tc>
+      </w:tr>
+      <w:tr>
+        <w:tc>
+          <w:tcPr>
+            <w:tcW w:type="dxa" w:w="2400"/>
+            <w:tcMar>
+              <w:top w:type="dxa" w:w="60"/>
+              <w:left w:type="dxa" w:w="80"/>
+              <w:bottom w:type="dxa" w:w="60"/>
+              <w:right w:type="dxa" w:w="80"/>
+            </w:tcMar>
+            <w:vAlign w:val="center"/>
+          </w:tcPr>
+          <w:p>
+            <w:pPr>
+              <w:jc w:val="center"/>
+            </w:pPr>
+            <w:r>
+              <w:rPr>
+                <w:rFonts w:ascii="Calibri" w:cs="Calibri" w:eastAsia="Calibri" w:hAnsi="Calibri"/>
+                <w:b/>
+                <w:bCs/>
+                <w:sz w:val="18"/>
+                <w:szCs w:val="18"/>
+              </w:rPr>
+              <w:t xml:space="preserve">Week 10</w:t>
+            </w:r>
+          </w:p>
+          <w:p>
+            <w:pPr>
+              <w:jc w:val="center"/>
+            </w:pPr>
+            <w:r>
+              <w:rPr>
+                <w:rFonts w:ascii="Calibri" w:cs="Calibri" w:eastAsia="Calibri" w:hAnsi="Calibri"/>
+                <w:color w:val="666666"/>
+                <w:sz w:val="16"/>
+                <w:szCs w:val="16"/>
+              </w:rPr>
+              <w:t xml:space="preserve">Nov 2 – Nov 8</w:t>
+            </w:r>
+          </w:p>
+        </w:tc>
+        <w:tc>
+          <w:tcPr>
+            <w:tcW w:type="dxa" w:w="2000"/>
+            <w:tcMar>
+              <w:top w:type="dxa" w:w="60"/>
+              <w:left w:type="dxa" w:w="80"/>
+              <w:bottom w:type="dxa" w:w="60"/>
+              <w:right w:type="dxa" w:w="80"/>
+            </w:tcMar>
+            <w:vAlign w:val="center"/>
+          </w:tcPr>
+          <w:p>
+            <w:pPr>
+              <w:jc w:val="center"/>
+            </w:pPr>
+            <w:r>
+              <w:rPr>
+                <w:rFonts w:ascii="Calibri" w:cs="Calibri" w:eastAsia="Calibri" w:hAnsi="Calibri"/>
+                <w:b w:val="false"/>
+                <w:bCs w:val="false"/>
+                <w:i w:val="false"/>
+                <w:iCs w:val="false"/>
+                <w:color w:val="000000"/>
+                <w:sz w:val="18"/>
+                <w:szCs w:val="18"/>
+              </w:rPr>
+              <w:t xml:space="preserve">Dr. Konrad ★</w:t>
+            </w:r>
+          </w:p>
+        </w:tc>
+        <w:tc>
+          <w:tcPr>
+            <w:tcW w:type="dxa" w:w="2000"/>
+            <w:tcMar>
+              <w:top w:type="dxa" w:w="60"/>
+              <w:left w:type="dxa" w:w="80"/>
+              <w:bottom w:type="dxa" w:w="60"/>
+              <w:right w:type="dxa" w:w="80"/>
+            </w:tcMar>
+            <w:vAlign w:val="center"/>
+          </w:tcPr>
+          <w:p>
+            <w:pPr>
+              <w:jc w:val="center"/>
+            </w:pPr>
+            <w:r>
+              <w:rPr>
+                <w:rFonts w:ascii="Calibri" w:cs="Calibri" w:eastAsia="Calibri" w:hAnsi="Calibri"/>
+                <w:b w:val="false"/>
+                <w:bCs w:val="false"/>
+                <w:i/>
+                <w:iCs/>
+                <w:color w:val="666666"/>
+                <w:sz w:val="16"/>
+                <w:szCs w:val="16"/>
+              </w:rPr>
+              <w:t xml:space="preserve">(covered by full week)</w:t>
+            </w:r>
+          </w:p>
+        </w:tc>
+        <w:tc>
+          <w:tcPr>
+            <w:tcW w:type="dxa" w:w="2000"/>
+            <w:tcMar>
+              <w:top w:type="dxa" w:w="60"/>
+              <w:left w:type="dxa" w:w="80"/>
+              <w:bottom w:type="dxa" w:w="60"/>
+              <w:right w:type="dxa" w:w="80"/>
+            </w:tcMar>
+            <w:vAlign w:val="center"/>
+          </w:tcPr>
+          <w:p>
+            <w:pPr>
+              <w:jc w:val="center"/>
+            </w:pPr>
+            <w:r>
+              <w:rPr>
+                <w:rFonts w:ascii="Calibri" w:cs="Calibri" w:eastAsia="Calibri" w:hAnsi="Calibri"/>
+                <w:b w:val="false"/>
+                <w:bCs w:val="false"/>
+                <w:i/>
+                <w:iCs/>
+                <w:color w:val="666666"/>
+                <w:sz w:val="16"/>
+                <w:szCs w:val="16"/>
+              </w:rPr>
+              <w:t xml:space="preserve">(covered by full week)</w:t>
+            </w:r>
+          </w:p>
+        </w:tc>
+        <w:tc>
+          <w:tcPr>
+            <w:tcW w:type="dxa" w:w="2000"/>
+            <w:tcMar>
+              <w:top w:type="dxa" w:w="60"/>
+              <w:left w:type="dxa" w:w="80"/>
+              <w:bottom w:type="dxa" w:w="60"/>
+              <w:right w:type="dxa" w:w="80"/>
+            </w:tcMar>
+            <w:vAlign w:val="center"/>
+          </w:tcPr>
+          <w:p>
+            <w:pPr>
+              <w:jc w:val="center"/>
+            </w:pPr>
+            <w:r>
+              <w:rPr>
+                <w:rFonts w:ascii="Calibri" w:cs="Calibri" w:eastAsia="Calibri" w:hAnsi="Calibri"/>
+                <w:b w:val="false"/>
+                <w:bCs w:val="false"/>
+                <w:i w:val="false"/>
+                <w:iCs w:val="false"/>
+                <w:color w:val="000000"/>
+                <w:sz w:val="18"/>
+                <w:szCs w:val="18"/>
+              </w:rPr>
+              <w:t xml:space="preserve">Dr. Okoye</w:t>
+            </w:r>
+          </w:p>
+        </w:tc>
+        <w:tc>
+          <w:tcPr>
+            <w:tcW w:type="dxa" w:w="2000"/>
+            <w:tcMar>
+              <w:top w:type="dxa" w:w="60"/>
+              <w:left w:type="dxa" w:w="80"/>
+              <w:bottom w:type="dxa" w:w="60"/>
+              <w:right w:type="dxa" w:w="80"/>
+            </w:tcMar>
+            <w:vAlign w:val="center"/>
+          </w:tcPr>
+          <w:p>
+            <w:pPr>
+              <w:jc w:val="center"/>
+            </w:pPr>
+            <w:r>
+              <w:rPr>
+                <w:rFonts w:ascii="Calibri" w:cs="Calibri" w:eastAsia="Calibri" w:hAnsi="Calibri"/>
+                <w:b w:val="false"/>
+                <w:bCs w:val="false"/>
+                <w:i/>
+                <w:iCs/>
+                <w:color w:val="666666"/>
+                <w:sz w:val="16"/>
+                <w:szCs w:val="16"/>
+              </w:rPr>
+              <w:t xml:space="preserve">(covered by full week)</w:t>
+            </w:r>
+          </w:p>
+        </w:tc>
+        <w:tc>
+          <w:tcPr>
+            <w:tcW w:type="dxa" w:w="2000"/>
+            <w:tcMar>
+              <w:top w:type="dxa" w:w="60"/>
+              <w:left w:type="dxa" w:w="80"/>
+              <w:bottom w:type="dxa" w:w="60"/>
+              <w:right w:type="dxa" w:w="80"/>
+            </w:tcMar>
+            <w:vAlign w:val="center"/>
+          </w:tcPr>
+          <w:p>
+            <w:pPr>
+              <w:jc w:val="center"/>
+            </w:pPr>
+            <w:r>
+              <w:rPr>
+                <w:rFonts w:ascii="Calibri" w:cs="Calibri" w:eastAsia="Calibri" w:hAnsi="Calibri"/>
+                <w:b w:val="false"/>
+                <w:bCs w:val="false"/>
+                <w:i/>
+                <w:iCs/>
+                <w:color w:val="666666"/>
+                <w:sz w:val="16"/>
+                <w:szCs w:val="16"/>
+              </w:rPr>
+              <w:t xml:space="preserve">(covered by full week)</w:t>
+            </w:r>
+          </w:p>
+        </w:tc>
+      </w:tr>
+    </w:tbl>
+    <w:p>
+      <w:pPr>
+        <w:pStyle w:val="Heading2"/>
+        <w:spacing w:after="120" w:before="240"/>
+      </w:pPr>
+      <w:r>
+        <w:rPr>
+          <w:rFonts w:ascii="Calibri" w:cs="Calibri" w:eastAsia="Calibri" w:hAnsi="Calibri"/>
+          <w:b/>
+          <w:bCs/>
+          <w:color w:val="1F3864"/>
+          <w:sz w:val="24"/>
+          <w:szCs w:val="24"/>
+        </w:rPr>
+        <w:t xml:space="preserve">Option B: open shifts (3 of 40)</w:t>
+      </w:r>
+    </w:p>
+    <w:p>
+      <w:pPr>
+        <w:spacing w:after="80"/>
+      </w:pPr>
+      <w:r>
+        <w:rPr>
+          <w:rFonts w:ascii="Calibri" w:cs="Calibri" w:eastAsia="Calibri" w:hAnsi="Calibri"/>
+          <w:b/>
+          <w:bCs/>
+          <w:i w:val="false"/>
+          <w:iCs w:val="false"/>
+          <w:color w:val="C00000"/>
+          <w:sz w:val="20"/>
+          <w:szCs w:val="20"/>
+        </w:rPr>
+        <w:t xml:space="preserve">EVENING — Week 1 Mon–Fri: Mon Aug 31 – Fri Sep 4  (no evening requests for week 1)</w:t>
+      </w:r>
+    </w:p>
+    <w:p>
+      <w:pPr>
+        <w:spacing w:after="80"/>
+      </w:pPr>
+      <w:r>
+        <w:rPr>
+          <w:rFonts w:ascii="Calibri" w:cs="Calibri" w:eastAsia="Calibri" w:hAnsi="Calibri"/>
+          <w:b/>
+          <w:bCs/>
+          <w:i w:val="false"/>
+          <w:iCs w:val="false"/>
+          <w:color w:val="C00000"/>
+          <w:sz w:val="20"/>
+          <w:szCs w:val="20"/>
+        </w:rPr>
+        <w:t xml:space="preserve">EVENING — Weekend 1: Sat Sep 5 – Sun Sep 6  (no evening requests for week 1)</w:t>
+      </w:r>
+    </w:p>
+    <w:p>
+      <w:pPr>
+        <w:spacing w:after="80"/>
+      </w:pPr>
+      <w:r>
+        <w:rPr>
+          <w:rFonts w:ascii="Calibri" w:cs="Calibri" w:eastAsia="Calibri" w:hAnsi="Calibri"/>
+          <w:b/>
+          <w:bCs/>
+          <w:i w:val="false"/>
+          <w:iCs w:val="false"/>
+          <w:color w:val="C00000"/>
+          <w:sz w:val="20"/>
+          <w:szCs w:val="20"/>
+        </w:rPr>
+        <w:t xml:space="preserve">EVENING — Weekend 3: Sat Sep 19 – Sun Sep 20  (only requester, Dr. Okoye, is on day shifts that week)</w:t>
+      </w:r>
+    </w:p>
+    <w:p>
+      <w:pPr>
+        <w:pStyle w:val="Heading2"/>
+        <w:spacing w:after="120" w:before="240"/>
+      </w:pPr>
+      <w:r>
+        <w:rPr>
+          <w:rFonts w:ascii="Calibri" w:cs="Calibri" w:eastAsia="Calibri" w:hAnsi="Calibri"/>
+          <w:b/>
+          <w:bCs/>
+          <w:color w:val="1F3864"/>
+          <w:sz w:val="24"/>
+          <w:szCs w:val="24"/>
+        </w:rPr>
+        <w:t xml:space="preserve">Option B: assignments vs. requests</w:t>
+      </w:r>
+    </w:p>
+    <w:tbl>
+      <w:tblPr>
+        <w:tblW w:type="dxa" w:w="14400"/>
+        <w:tblBorders>
+          <w:top w:val="single" w:color="auto" w:sz="4"/>
+          <w:left w:val="single" w:color="auto" w:sz="4"/>
+          <w:bottom w:val="single" w:color="auto" w:sz="4"/>
+          <w:right w:val="single" w:color="auto" w:sz="4"/>
+          <w:insideH w:val="single" w:color="auto" w:sz="4"/>
+          <w:insideV w:val="single" w:color="auto" w:sz="4"/>
+        </w:tblBorders>
+      </w:tblPr>
+      <w:tblGrid>
+        <w:gridCol w:w="2400"/>
+        <w:gridCol w:w="1700"/>
+        <w:gridCol w:w="1700"/>
+        <w:gridCol w:w="1700"/>
+        <w:gridCol w:w="6900"/>
+      </w:tblGrid>
+      <w:tr>
+        <w:tc>
+          <w:tcPr>
+            <w:tcW w:type="dxa" w:w="2400"/>
+            <w:shd w:fill="1F3864" w:val="clear"/>
+            <w:tcMar>
+              <w:top w:type="dxa" w:w="60"/>
+              <w:left w:type="dxa" w:w="80"/>
+              <w:bottom w:type="dxa" w:w="60"/>
+              <w:right w:type="dxa" w:w="80"/>
+            </w:tcMar>
+            <w:vAlign w:val="center"/>
+          </w:tcPr>
+          <w:p>
+            <w:pPr>
+              <w:jc w:val="center"/>
+            </w:pPr>
+            <w:r>
+              <w:rPr>
+                <w:rFonts w:ascii="Calibri" w:cs="Calibri" w:eastAsia="Calibri" w:hAnsi="Calibri"/>
+                <w:b/>
+                <w:bCs/>
+                <w:i w:val="false"/>
+                <w:iCs w:val="false"/>
+                <w:color w:val="FFFFFF"/>
+                <w:sz w:val="18"/>
+                <w:szCs w:val="18"/>
+              </w:rPr>
+              <w:t xml:space="preserve">Person</w:t>
+            </w:r>
+          </w:p>
+        </w:tc>
+        <w:tc>
+          <w:tcPr>
+            <w:tcW w:type="dxa" w:w="1700"/>
+            <w:shd w:fill="1F3864" w:val="clear"/>
+            <w:tcMar>
+              <w:top w:type="dxa" w:w="60"/>
+              <w:left w:type="dxa" w:w="80"/>
+              <w:bottom w:type="dxa" w:w="60"/>
+              <w:right w:type="dxa" w:w="80"/>
+            </w:tcMar>
+            <w:vAlign w:val="center"/>
+          </w:tcPr>
+          <w:p>
+            <w:pPr>
+              <w:jc w:val="center"/>
+            </w:pPr>
+            <w:r>
+              <w:rPr>
+                <w:rFonts w:ascii="Calibri" w:cs="Calibri" w:eastAsia="Calibri" w:hAnsi="Calibri"/>
+                <w:b/>
+                <w:bCs/>
+                <w:i w:val="false"/>
+                <w:iCs w:val="false"/>
+                <w:color w:val="FFFFFF"/>
+                <w:sz w:val="18"/>
+                <w:szCs w:val="18"/>
+              </w:rPr>
+              <w:t xml:space="preserve">DAY weeks (assigned / wanted)</w:t>
+            </w:r>
+          </w:p>
+        </w:tc>
+        <w:tc>
+          <w:tcPr>
+            <w:tcW w:type="dxa" w:w="1700"/>
+            <w:shd w:fill="1F3864" w:val="clear"/>
+            <w:tcMar>
+              <w:top w:type="dxa" w:w="60"/>
+              <w:left w:type="dxa" w:w="80"/>
+              <w:bottom w:type="dxa" w:w="60"/>
+              <w:right w:type="dxa" w:w="80"/>
+            </w:tcMar>
+            <w:vAlign w:val="center"/>
+          </w:tcPr>
+          <w:p>
+            <w:pPr>
+              <w:jc w:val="center"/>
+            </w:pPr>
+            <w:r>
+              <w:rPr>
+                <w:rFonts w:ascii="Calibri" w:cs="Calibri" w:eastAsia="Calibri" w:hAnsi="Calibri"/>
+                <w:b/>
+                <w:bCs/>
+                <w:i w:val="false"/>
+                <w:iCs w:val="false"/>
+                <w:color w:val="FFFFFF"/>
+                <w:sz w:val="18"/>
+                <w:szCs w:val="18"/>
+              </w:rPr>
+              <w:t xml:space="preserve">EVENING weeks (assigned / wanted)</w:t>
+            </w:r>
+          </w:p>
+        </w:tc>
+        <w:tc>
+          <w:tcPr>
+            <w:tcW w:type="dxa" w:w="1700"/>
+            <w:shd w:fill="1F3864" w:val="clear"/>
+            <w:tcMar>
+              <w:top w:type="dxa" w:w="60"/>
+              <w:left w:type="dxa" w:w="80"/>
+              <w:bottom w:type="dxa" w:w="60"/>
+              <w:right w:type="dxa" w:w="80"/>
+            </w:tcMar>
+            <w:vAlign w:val="center"/>
+          </w:tcPr>
+          <w:p>
+            <w:pPr>
+              <w:jc w:val="center"/>
+            </w:pPr>
+            <w:r>
+              <w:rPr>
+                <w:rFonts w:ascii="Calibri" w:cs="Calibri" w:eastAsia="Calibri" w:hAnsi="Calibri"/>
+                <w:b/>
+                <w:bCs/>
+                <w:i w:val="false"/>
+                <w:iCs w:val="false"/>
+                <w:color w:val="FFFFFF"/>
+                <w:sz w:val="18"/>
+                <w:szCs w:val="18"/>
+              </w:rPr>
+              <w:t xml:space="preserve">Weekends (assigned / max)</w:t>
+            </w:r>
+          </w:p>
+        </w:tc>
+        <w:tc>
+          <w:tcPr>
+            <w:tcW w:type="dxa" w:w="6900"/>
+            <w:shd w:fill="1F3864" w:val="clear"/>
+            <w:tcMar>
+              <w:top w:type="dxa" w:w="60"/>
+              <w:left w:type="dxa" w:w="80"/>
+              <w:bottom w:type="dxa" w:w="60"/>
+              <w:right w:type="dxa" w:w="80"/>
+            </w:tcMar>
+            <w:vAlign w:val="center"/>
+          </w:tcPr>
+          <w:p>
+            <w:pPr>
+              <w:jc w:val="center"/>
+            </w:pPr>
+            <w:r>
+              <w:rPr>
+                <w:rFonts w:ascii="Calibri" w:cs="Calibri" w:eastAsia="Calibri" w:hAnsi="Calibri"/>
+                <w:b/>
+                <w:bCs/>
+                <w:i w:val="false"/>
+                <w:iCs w:val="false"/>
+                <w:color w:val="FFFFFF"/>
+                <w:sz w:val="18"/>
+                <w:szCs w:val="18"/>
+              </w:rPr>
+              <w:t xml:space="preserve">Notes</w:t>
+            </w:r>
+          </w:p>
+        </w:tc>
+      </w:tr>
+      <w:tr>
+        <w:tc>
+          <w:tcPr>
+            <w:tcW w:type="dxa" w:w="2400"/>
+            <w:tcMar>
+              <w:top w:type="dxa" w:w="60"/>
+              <w:left w:type="dxa" w:w="80"/>
+              <w:bottom w:type="dxa" w:w="60"/>
+              <w:right w:type="dxa" w:w="80"/>
+            </w:tcMar>
+            <w:vAlign w:val="center"/>
+          </w:tcPr>
+          <w:p>
+            <w:pPr>
+              <w:jc w:val="center"/>
+            </w:pPr>
+            <w:r>
+              <w:rPr>
+                <w:rFonts w:ascii="Calibri" w:cs="Calibri" w:eastAsia="Calibri" w:hAnsi="Calibri"/>
+                <w:b w:val="false"/>
+                <w:bCs w:val="false"/>
+                <w:i w:val="false"/>
+                <w:iCs w:val="false"/>
+                <w:color w:val="000000"/>
+                <w:sz w:val="18"/>
+                <w:szCs w:val="18"/>
+              </w:rPr>
+              <w:t xml:space="preserve">Dr. Bolton</w:t>
+            </w:r>
+          </w:p>
+        </w:tc>
+        <w:tc>
+          <w:tcPr>
+            <w:tcW w:type="dxa" w:w="1700"/>
+            <w:tcMar>
+              <w:top w:type="dxa" w:w="60"/>
+              <w:left w:type="dxa" w:w="80"/>
+              <w:bottom w:type="dxa" w:w="60"/>
+              <w:right w:type="dxa" w:w="80"/>
+            </w:tcMar>
+            <w:vAlign w:val="center"/>
+          </w:tcPr>
+          <w:p>
+            <w:pPr>
+              <w:jc w:val="center"/>
+            </w:pPr>
+            <w:r>
+              <w:rPr>
+                <w:rFonts w:ascii="Calibri" w:cs="Calibri" w:eastAsia="Calibri" w:hAnsi="Calibri"/>
+                <w:b w:val="false"/>
+                <w:bCs w:val="false"/>
+                <w:i w:val="false"/>
+                <w:iCs w:val="false"/>
+                <w:color w:val="000000"/>
+                <w:sz w:val="18"/>
+                <w:szCs w:val="18"/>
+              </w:rPr>
+              <w:t xml:space="preserve">1 / 1</w:t>
+            </w:r>
+          </w:p>
+        </w:tc>
+        <w:tc>
+          <w:tcPr>
+            <w:tcW w:type="dxa" w:w="1700"/>
+            <w:tcMar>
+              <w:top w:type="dxa" w:w="60"/>
+              <w:left w:type="dxa" w:w="80"/>
+              <w:bottom w:type="dxa" w:w="60"/>
+              <w:right w:type="dxa" w:w="80"/>
+            </w:tcMar>
+            <w:vAlign w:val="center"/>
+          </w:tcPr>
+          <w:p>
+            <w:pPr>
+              <w:jc w:val="center"/>
+            </w:pPr>
+            <w:r>
+              <w:rPr>
+                <w:rFonts w:ascii="Calibri" w:cs="Calibri" w:eastAsia="Calibri" w:hAnsi="Calibri"/>
+                <w:b w:val="false"/>
+                <w:bCs w:val="false"/>
+                <w:i w:val="false"/>
+                <w:iCs w:val="false"/>
+                <w:color w:val="000000"/>
+                <w:sz w:val="18"/>
+                <w:szCs w:val="18"/>
+              </w:rPr>
+              <w:t xml:space="preserve">—</w:t>
+            </w:r>
+          </w:p>
+        </w:tc>
+        <w:tc>
+          <w:tcPr>
+            <w:tcW w:type="dxa" w:w="1700"/>
+            <w:tcMar>
+              <w:top w:type="dxa" w:w="60"/>
+              <w:left w:type="dxa" w:w="80"/>
+              <w:bottom w:type="dxa" w:w="60"/>
+              <w:right w:type="dxa" w:w="80"/>
+            </w:tcMar>
+            <w:vAlign w:val="center"/>
+          </w:tcPr>
+          <w:p>
+            <w:pPr>
+              <w:jc w:val="center"/>
+            </w:pPr>
+            <w:r>
+              <w:rPr>
+                <w:rFonts w:ascii="Calibri" w:cs="Calibri" w:eastAsia="Calibri" w:hAnsi="Calibri"/>
+                <w:b w:val="false"/>
+                <w:bCs w:val="false"/>
+                <w:i w:val="false"/>
+                <w:iCs w:val="false"/>
+                <w:color w:val="000000"/>
+                <w:sz w:val="18"/>
+                <w:szCs w:val="18"/>
+              </w:rPr>
+              <w:t xml:space="preserve">1 / 1</w:t>
+            </w:r>
+          </w:p>
+        </w:tc>
+        <w:tc>
+          <w:tcPr>
+            <w:tcW w:type="dxa" w:w="6900"/>
+            <w:tcMar>
+              <w:top w:type="dxa" w:w="60"/>
+              <w:left w:type="dxa" w:w="80"/>
+              <w:bottom w:type="dxa" w:w="60"/>
+              <w:right w:type="dxa" w:w="80"/>
+            </w:tcMar>
+            <w:vAlign w:val="center"/>
+          </w:tcPr>
+          <w:p>
+            <w:pPr>
+              <w:jc w:val="center"/>
+            </w:pPr>
+            <w:r>
+              <w:rPr>
+                <w:rFonts w:ascii="Calibri" w:cs="Calibri" w:eastAsia="Calibri" w:hAnsi="Calibri"/>
+                <w:b w:val="false"/>
+                <w:bCs w:val="false"/>
+                <w:i w:val="false"/>
+                <w:iCs w:val="false"/>
+                <w:color w:val="000000"/>
+                <w:sz w:val="18"/>
+                <w:szCs w:val="18"/>
+              </w:rPr>
+              <w:t xml:space="preserve">Full week 9 — his 1st choice</w:t>
+            </w:r>
+          </w:p>
+        </w:tc>
+      </w:tr>
+      <w:tr>
+        <w:tc>
+          <w:tcPr>
+            <w:tcW w:type="dxa" w:w="2400"/>
+            <w:tcMar>
+              <w:top w:type="dxa" w:w="60"/>
+              <w:left w:type="dxa" w:w="80"/>
+              <w:bottom w:type="dxa" w:w="60"/>
+              <w:right w:type="dxa" w:w="80"/>
+            </w:tcMar>
+            <w:vAlign w:val="center"/>
+          </w:tcPr>
+          <w:p>
+            <w:pPr>
+              <w:jc w:val="center"/>
+            </w:pPr>
+            <w:r>
+              <w:rPr>
+                <w:rFonts w:ascii="Calibri" w:cs="Calibri" w:eastAsia="Calibri" w:hAnsi="Calibri"/>
+                <w:b w:val="false"/>
+                <w:bCs w:val="false"/>
+                <w:i w:val="false"/>
+                <w:iCs w:val="false"/>
+                <w:color w:val="000000"/>
+                <w:sz w:val="18"/>
+                <w:szCs w:val="18"/>
+              </w:rPr>
+              <w:t xml:space="preserve">Dr. Brainch</w:t>
+            </w:r>
+          </w:p>
+        </w:tc>
+        <w:tc>
+          <w:tcPr>
+            <w:tcW w:type="dxa" w:w="1700"/>
+            <w:tcMar>
+              <w:top w:type="dxa" w:w="60"/>
+              <w:left w:type="dxa" w:w="80"/>
+              <w:bottom w:type="dxa" w:w="60"/>
+              <w:right w:type="dxa" w:w="80"/>
+            </w:tcMar>
+            <w:vAlign w:val="center"/>
+          </w:tcPr>
+          <w:p>
+            <w:pPr>
+              <w:jc w:val="center"/>
+            </w:pPr>
+            <w:r>
+              <w:rPr>
+                <w:rFonts w:ascii="Calibri" w:cs="Calibri" w:eastAsia="Calibri" w:hAnsi="Calibri"/>
+                <w:b w:val="false"/>
+                <w:bCs w:val="false"/>
+                <w:i w:val="false"/>
+                <w:iCs w:val="false"/>
+                <w:color w:val="000000"/>
+                <w:sz w:val="18"/>
+                <w:szCs w:val="18"/>
+              </w:rPr>
+              <w:t xml:space="preserve">1 / 2</w:t>
+            </w:r>
+          </w:p>
+        </w:tc>
+        <w:tc>
+          <w:tcPr>
+            <w:tcW w:type="dxa" w:w="1700"/>
+            <w:tcMar>
+              <w:top w:type="dxa" w:w="60"/>
+              <w:left w:type="dxa" w:w="80"/>
+              <w:bottom w:type="dxa" w:w="60"/>
+              <w:right w:type="dxa" w:w="80"/>
+            </w:tcMar>
+            <w:vAlign w:val="center"/>
+          </w:tcPr>
+          <w:p>
+            <w:pPr>
+              <w:jc w:val="center"/>
+            </w:pPr>
+            <w:r>
+              <w:rPr>
+                <w:rFonts w:ascii="Calibri" w:cs="Calibri" w:eastAsia="Calibri" w:hAnsi="Calibri"/>
+                <w:b w:val="false"/>
+                <w:bCs w:val="false"/>
+                <w:i w:val="false"/>
+                <w:iCs w:val="false"/>
+                <w:color w:val="000000"/>
+                <w:sz w:val="18"/>
+                <w:szCs w:val="18"/>
+              </w:rPr>
+              <w:t xml:space="preserve">—</w:t>
+            </w:r>
+          </w:p>
+        </w:tc>
+        <w:tc>
+          <w:tcPr>
+            <w:tcW w:type="dxa" w:w="1700"/>
+            <w:tcMar>
+              <w:top w:type="dxa" w:w="60"/>
+              <w:left w:type="dxa" w:w="80"/>
+              <w:bottom w:type="dxa" w:w="60"/>
+              <w:right w:type="dxa" w:w="80"/>
+            </w:tcMar>
+            <w:vAlign w:val="center"/>
+          </w:tcPr>
+          <w:p>
+            <w:pPr>
+              <w:jc w:val="center"/>
+            </w:pPr>
+            <w:r>
+              <w:rPr>
+                <w:rFonts w:ascii="Calibri" w:cs="Calibri" w:eastAsia="Calibri" w:hAnsi="Calibri"/>
+                <w:b w:val="false"/>
+                <w:bCs w:val="false"/>
+                <w:i w:val="false"/>
+                <w:iCs w:val="false"/>
+                <w:color w:val="000000"/>
+                <w:sz w:val="18"/>
+                <w:szCs w:val="18"/>
+              </w:rPr>
+              <w:t xml:space="preserve">0 / 0</w:t>
+            </w:r>
+          </w:p>
+        </w:tc>
+        <w:tc>
+          <w:tcPr>
+            <w:tcW w:type="dxa" w:w="6900"/>
+            <w:tcMar>
+              <w:top w:type="dxa" w:w="60"/>
+              <w:left w:type="dxa" w:w="80"/>
+              <w:bottom w:type="dxa" w:w="60"/>
+              <w:right w:type="dxa" w:w="80"/>
+            </w:tcMar>
+            <w:vAlign w:val="center"/>
+          </w:tcPr>
+          <w:p>
+            <w:pPr>
+              <w:jc w:val="center"/>
+            </w:pPr>
+            <w:r>
+              <w:rPr>
+                <w:rFonts w:ascii="Calibri" w:cs="Calibri" w:eastAsia="Calibri" w:hAnsi="Calibri"/>
+                <w:b w:val="false"/>
+                <w:bCs w:val="false"/>
+                <w:i w:val="false"/>
+                <w:iCs w:val="false"/>
+                <w:color w:val="000000"/>
+                <w:sz w:val="18"/>
+                <w:szCs w:val="18"/>
+              </w:rPr>
+              <w:t xml:space="preserve">Mon–Fri only (weekend max 0); 1st choice W10 not possible — Dr. Konrad's only weeks are 8 and 10</w:t>
+            </w:r>
+          </w:p>
+        </w:tc>
+      </w:tr>
+      <w:tr>
+        <w:tc>
+          <w:tcPr>
+            <w:tcW w:type="dxa" w:w="2400"/>
+            <w:tcMar>
+              <w:top w:type="dxa" w:w="60"/>
+              <w:left w:type="dxa" w:w="80"/>
+              <w:bottom w:type="dxa" w:w="60"/>
+              <w:right w:type="dxa" w:w="80"/>
+            </w:tcMar>
+            <w:vAlign w:val="center"/>
+          </w:tcPr>
+          <w:p>
+            <w:pPr>
+              <w:jc w:val="center"/>
+            </w:pPr>
+            <w:r>
+              <w:rPr>
+                <w:rFonts w:ascii="Calibri" w:cs="Calibri" w:eastAsia="Calibri" w:hAnsi="Calibri"/>
+                <w:b w:val="false"/>
+                <w:bCs w:val="false"/>
+                <w:i w:val="false"/>
+                <w:iCs w:val="false"/>
+                <w:color w:val="000000"/>
+                <w:sz w:val="18"/>
+                <w:szCs w:val="18"/>
+              </w:rPr>
+              <w:t xml:space="preserve">Dr. Braun</w:t>
+            </w:r>
+          </w:p>
+        </w:tc>
+        <w:tc>
+          <w:tcPr>
+            <w:tcW w:type="dxa" w:w="1700"/>
+            <w:tcMar>
+              <w:top w:type="dxa" w:w="60"/>
+              <w:left w:type="dxa" w:w="80"/>
+              <w:bottom w:type="dxa" w:w="60"/>
+              <w:right w:type="dxa" w:w="80"/>
+            </w:tcMar>
+            <w:vAlign w:val="center"/>
+          </w:tcPr>
+          <w:p>
+            <w:pPr>
+              <w:jc w:val="center"/>
+            </w:pPr>
+            <w:r>
+              <w:rPr>
+                <w:rFonts w:ascii="Calibri" w:cs="Calibri" w:eastAsia="Calibri" w:hAnsi="Calibri"/>
+                <w:b w:val="false"/>
+                <w:bCs w:val="false"/>
+                <w:i w:val="false"/>
+                <w:iCs w:val="false"/>
+                <w:color w:val="000000"/>
+                <w:sz w:val="18"/>
+                <w:szCs w:val="18"/>
+              </w:rPr>
+              <w:t xml:space="preserve">0 / 0</w:t>
+            </w:r>
+          </w:p>
+        </w:tc>
+        <w:tc>
+          <w:tcPr>
+            <w:tcW w:type="dxa" w:w="1700"/>
+            <w:tcMar>
+              <w:top w:type="dxa" w:w="60"/>
+              <w:left w:type="dxa" w:w="80"/>
+              <w:bottom w:type="dxa" w:w="60"/>
+              <w:right w:type="dxa" w:w="80"/>
+            </w:tcMar>
+            <w:vAlign w:val="center"/>
+          </w:tcPr>
+          <w:p>
+            <w:pPr>
+              <w:jc w:val="center"/>
+            </w:pPr>
+            <w:r>
+              <w:rPr>
+                <w:rFonts w:ascii="Calibri" w:cs="Calibri" w:eastAsia="Calibri" w:hAnsi="Calibri"/>
+                <w:b w:val="false"/>
+                <w:bCs w:val="false"/>
+                <w:i w:val="false"/>
+                <w:iCs w:val="false"/>
+                <w:color w:val="000000"/>
+                <w:sz w:val="18"/>
+                <w:szCs w:val="18"/>
+              </w:rPr>
+              <w:t xml:space="preserve">0 / 0</w:t>
+            </w:r>
+          </w:p>
+        </w:tc>
+        <w:tc>
+          <w:tcPr>
+            <w:tcW w:type="dxa" w:w="1700"/>
+            <w:tcMar>
+              <w:top w:type="dxa" w:w="60"/>
+              <w:left w:type="dxa" w:w="80"/>
+              <w:bottom w:type="dxa" w:w="60"/>
+              <w:right w:type="dxa" w:w="80"/>
+            </w:tcMar>
+            <w:vAlign w:val="center"/>
+          </w:tcPr>
+          <w:p>
+            <w:pPr>
+              <w:jc w:val="center"/>
+            </w:pPr>
+            <w:r>
+              <w:rPr>
+                <w:rFonts w:ascii="Calibri" w:cs="Calibri" w:eastAsia="Calibri" w:hAnsi="Calibri"/>
+                <w:b w:val="false"/>
+                <w:bCs w:val="false"/>
+                <w:i w:val="false"/>
+                <w:iCs w:val="false"/>
+                <w:color w:val="000000"/>
+                <w:sz w:val="18"/>
+                <w:szCs w:val="18"/>
+              </w:rPr>
+              <w:t xml:space="preserve">0 / 0</w:t>
+            </w:r>
+          </w:p>
+        </w:tc>
+        <w:tc>
+          <w:tcPr>
+            <w:tcW w:type="dxa" w:w="6900"/>
+            <w:tcMar>
+              <w:top w:type="dxa" w:w="60"/>
+              <w:left w:type="dxa" w:w="80"/>
+              <w:bottom w:type="dxa" w:w="60"/>
+              <w:right w:type="dxa" w:w="80"/>
+            </w:tcMar>
+            <w:vAlign w:val="center"/>
+          </w:tcPr>
+          <w:p>
+            <w:pPr>
+              <w:jc w:val="center"/>
+            </w:pPr>
+            <w:r>
+              <w:rPr>
+                <w:rFonts w:ascii="Calibri" w:cs="Calibri" w:eastAsia="Calibri" w:hAnsi="Calibri"/>
+                <w:b w:val="false"/>
+                <w:bCs w:val="false"/>
+                <w:i w:val="false"/>
+                <w:iCs w:val="false"/>
+                <w:color w:val="000000"/>
+                <w:sz w:val="18"/>
+                <w:szCs w:val="18"/>
+              </w:rPr>
+              <w:t xml:space="preserve">Requested no shifts this period</w:t>
+            </w:r>
+          </w:p>
+        </w:tc>
+      </w:tr>
+      <w:tr>
+        <w:tc>
+          <w:tcPr>
+            <w:tcW w:type="dxa" w:w="2400"/>
+            <w:tcMar>
+              <w:top w:type="dxa" w:w="60"/>
+              <w:left w:type="dxa" w:w="80"/>
+              <w:bottom w:type="dxa" w:w="60"/>
+              <w:right w:type="dxa" w:w="80"/>
+            </w:tcMar>
+            <w:vAlign w:val="center"/>
+          </w:tcPr>
+          <w:p>
+            <w:pPr>
+              <w:jc w:val="center"/>
+            </w:pPr>
+            <w:r>
+              <w:rPr>
+                <w:rFonts w:ascii="Calibri" w:cs="Calibri" w:eastAsia="Calibri" w:hAnsi="Calibri"/>
+                <w:b w:val="false"/>
+                <w:bCs w:val="false"/>
+                <w:i w:val="false"/>
+                <w:iCs w:val="false"/>
+                <w:color w:val="000000"/>
+                <w:sz w:val="18"/>
+                <w:szCs w:val="18"/>
+              </w:rPr>
+              <w:t xml:space="preserve">Dr. Classen</w:t>
+            </w:r>
+          </w:p>
+        </w:tc>
+        <w:tc>
+          <w:tcPr>
+            <w:tcW w:type="dxa" w:w="1700"/>
+            <w:tcMar>
+              <w:top w:type="dxa" w:w="60"/>
+              <w:left w:type="dxa" w:w="80"/>
+              <w:bottom w:type="dxa" w:w="60"/>
+              <w:right w:type="dxa" w:w="80"/>
+            </w:tcMar>
+            <w:vAlign w:val="center"/>
+          </w:tcPr>
+          <w:p>
+            <w:pPr>
+              <w:jc w:val="center"/>
+            </w:pPr>
+            <w:r>
+              <w:rPr>
+                <w:rFonts w:ascii="Calibri" w:cs="Calibri" w:eastAsia="Calibri" w:hAnsi="Calibri"/>
+                <w:b w:val="false"/>
+                <w:bCs w:val="false"/>
+                <w:i w:val="false"/>
+                <w:iCs w:val="false"/>
+                <w:color w:val="000000"/>
+                <w:sz w:val="18"/>
+                <w:szCs w:val="18"/>
+              </w:rPr>
+              <w:t xml:space="preserve">1 / 2</w:t>
+            </w:r>
+          </w:p>
+        </w:tc>
+        <w:tc>
+          <w:tcPr>
+            <w:tcW w:type="dxa" w:w="1700"/>
+            <w:tcMar>
+              <w:top w:type="dxa" w:w="60"/>
+              <w:left w:type="dxa" w:w="80"/>
+              <w:bottom w:type="dxa" w:w="60"/>
+              <w:right w:type="dxa" w:w="80"/>
+            </w:tcMar>
+            <w:vAlign w:val="center"/>
+          </w:tcPr>
+          <w:p>
+            <w:pPr>
+              <w:jc w:val="center"/>
+            </w:pPr>
+            <w:r>
+              <w:rPr>
+                <w:rFonts w:ascii="Calibri" w:cs="Calibri" w:eastAsia="Calibri" w:hAnsi="Calibri"/>
+                <w:b w:val="false"/>
+                <w:bCs w:val="false"/>
+                <w:i w:val="false"/>
+                <w:iCs w:val="false"/>
+                <w:color w:val="000000"/>
+                <w:sz w:val="18"/>
+                <w:szCs w:val="18"/>
+              </w:rPr>
+              <w:t xml:space="preserve">2 / 2</w:t>
+            </w:r>
+          </w:p>
+        </w:tc>
+        <w:tc>
+          <w:tcPr>
+            <w:tcW w:type="dxa" w:w="1700"/>
+            <w:tcMar>
+              <w:top w:type="dxa" w:w="60"/>
+              <w:left w:type="dxa" w:w="80"/>
+              <w:bottom w:type="dxa" w:w="60"/>
+              <w:right w:type="dxa" w:w="80"/>
+            </w:tcMar>
+            <w:vAlign w:val="center"/>
+          </w:tcPr>
+          <w:p>
+            <w:pPr>
+              <w:jc w:val="center"/>
+            </w:pPr>
+            <w:r>
+              <w:rPr>
+                <w:rFonts w:ascii="Calibri" w:cs="Calibri" w:eastAsia="Calibri" w:hAnsi="Calibri"/>
+                <w:b w:val="false"/>
+                <w:bCs w:val="false"/>
+                <w:i w:val="false"/>
+                <w:iCs w:val="false"/>
+                <w:color w:val="000000"/>
+                <w:sz w:val="18"/>
+                <w:szCs w:val="18"/>
+              </w:rPr>
+              <w:t xml:space="preserve">3 / 3</w:t>
+            </w:r>
+          </w:p>
+        </w:tc>
+        <w:tc>
+          <w:tcPr>
+            <w:tcW w:type="dxa" w:w="6900"/>
+            <w:tcMar>
+              <w:top w:type="dxa" w:w="60"/>
+              <w:left w:type="dxa" w:w="80"/>
+              <w:bottom w:type="dxa" w:w="60"/>
+              <w:right w:type="dxa" w:w="80"/>
+            </w:tcMar>
+            <w:vAlign w:val="center"/>
+          </w:tcPr>
+          <w:p>
+            <w:pPr>
+              <w:jc w:val="center"/>
+            </w:pPr>
+            <w:r>
+              <w:rPr>
+                <w:rFonts w:ascii="Calibri" w:cs="Calibri" w:eastAsia="Calibri" w:hAnsi="Calibri"/>
+                <w:b w:val="false"/>
+                <w:bCs w:val="false"/>
+                <w:i w:val="false"/>
+                <w:iCs w:val="false"/>
+                <w:color w:val="000000"/>
+                <w:sz w:val="18"/>
+                <w:szCs w:val="18"/>
+              </w:rPr>
+              <w:t xml:space="preserve">Day full week 2; evening full weeks 5 (1st choice) and 9; weekend max reached</w:t>
+            </w:r>
+          </w:p>
+        </w:tc>
+      </w:tr>
+      <w:tr>
+        <w:tc>
+          <w:tcPr>
+            <w:tcW w:type="dxa" w:w="2400"/>
+            <w:tcMar>
+              <w:top w:type="dxa" w:w="60"/>
+              <w:left w:type="dxa" w:w="80"/>
+              <w:bottom w:type="dxa" w:w="60"/>
+              <w:right w:type="dxa" w:w="80"/>
+            </w:tcMar>
+            <w:vAlign w:val="center"/>
+          </w:tcPr>
+          <w:p>
+            <w:pPr>
+              <w:jc w:val="center"/>
+            </w:pPr>
+            <w:r>
+              <w:rPr>
+                <w:rFonts w:ascii="Calibri" w:cs="Calibri" w:eastAsia="Calibri" w:hAnsi="Calibri"/>
+                <w:b w:val="false"/>
+                <w:bCs w:val="false"/>
+                <w:i w:val="false"/>
+                <w:iCs w:val="false"/>
+                <w:color w:val="000000"/>
+                <w:sz w:val="18"/>
+                <w:szCs w:val="18"/>
+              </w:rPr>
+              <w:t xml:space="preserve">Dr. Gill</w:t>
+            </w:r>
+          </w:p>
+        </w:tc>
+        <w:tc>
+          <w:tcPr>
+            <w:tcW w:type="dxa" w:w="1700"/>
+            <w:tcMar>
+              <w:top w:type="dxa" w:w="60"/>
+              <w:left w:type="dxa" w:w="80"/>
+              <w:bottom w:type="dxa" w:w="60"/>
+              <w:right w:type="dxa" w:w="80"/>
+            </w:tcMar>
+            <w:vAlign w:val="center"/>
+          </w:tcPr>
+          <w:p>
+            <w:pPr>
+              <w:jc w:val="center"/>
+            </w:pPr>
+            <w:r>
+              <w:rPr>
+                <w:rFonts w:ascii="Calibri" w:cs="Calibri" w:eastAsia="Calibri" w:hAnsi="Calibri"/>
+                <w:b w:val="false"/>
+                <w:bCs w:val="false"/>
+                <w:i w:val="false"/>
+                <w:iCs w:val="false"/>
+                <w:color w:val="000000"/>
+                <w:sz w:val="18"/>
+                <w:szCs w:val="18"/>
+              </w:rPr>
+              <w:t xml:space="preserve">1 / 1</w:t>
+            </w:r>
+          </w:p>
+        </w:tc>
+        <w:tc>
+          <w:tcPr>
+            <w:tcW w:type="dxa" w:w="1700"/>
+            <w:tcMar>
+              <w:top w:type="dxa" w:w="60"/>
+              <w:left w:type="dxa" w:w="80"/>
+              <w:bottom w:type="dxa" w:w="60"/>
+              <w:right w:type="dxa" w:w="80"/>
+            </w:tcMar>
+            <w:vAlign w:val="center"/>
+          </w:tcPr>
+          <w:p>
+            <w:pPr>
+              <w:jc w:val="center"/>
+            </w:pPr>
+            <w:r>
+              <w:rPr>
+                <w:rFonts w:ascii="Calibri" w:cs="Calibri" w:eastAsia="Calibri" w:hAnsi="Calibri"/>
+                <w:b w:val="false"/>
+                <w:bCs w:val="false"/>
+                <w:i w:val="false"/>
+                <w:iCs w:val="false"/>
+                <w:color w:val="000000"/>
+                <w:sz w:val="18"/>
+                <w:szCs w:val="18"/>
+              </w:rPr>
+              <w:t xml:space="preserve">—</w:t>
+            </w:r>
+          </w:p>
+        </w:tc>
+        <w:tc>
+          <w:tcPr>
+            <w:tcW w:type="dxa" w:w="1700"/>
+            <w:tcMar>
+              <w:top w:type="dxa" w:w="60"/>
+              <w:left w:type="dxa" w:w="80"/>
+              <w:bottom w:type="dxa" w:w="60"/>
+              <w:right w:type="dxa" w:w="80"/>
+            </w:tcMar>
+            <w:vAlign w:val="center"/>
+          </w:tcPr>
+          <w:p>
+            <w:pPr>
+              <w:jc w:val="center"/>
+            </w:pPr>
+            <w:r>
+              <w:rPr>
+                <w:rFonts w:ascii="Calibri" w:cs="Calibri" w:eastAsia="Calibri" w:hAnsi="Calibri"/>
+                <w:b w:val="false"/>
+                <w:bCs w:val="false"/>
+                <w:i w:val="false"/>
+                <w:iCs w:val="false"/>
+                <w:color w:val="000000"/>
+                <w:sz w:val="18"/>
+                <w:szCs w:val="18"/>
+              </w:rPr>
+              <w:t xml:space="preserve">1 / ?</w:t>
+            </w:r>
+          </w:p>
+        </w:tc>
+        <w:tc>
+          <w:tcPr>
+            <w:tcW w:type="dxa" w:w="6900"/>
+            <w:tcMar>
+              <w:top w:type="dxa" w:w="60"/>
+              <w:left w:type="dxa" w:w="80"/>
+              <w:bottom w:type="dxa" w:w="60"/>
+              <w:right w:type="dxa" w:w="80"/>
+            </w:tcMar>
+            <w:vAlign w:val="center"/>
+          </w:tcPr>
+          <w:p>
+            <w:pPr>
+              <w:jc w:val="center"/>
+            </w:pPr>
+            <w:r>
+              <w:rPr>
+                <w:rFonts w:ascii="Calibri" w:cs="Calibri" w:eastAsia="Calibri" w:hAnsi="Calibri"/>
+                <w:b w:val="false"/>
+                <w:bCs w:val="false"/>
+                <w:i w:val="false"/>
+                <w:iCs w:val="false"/>
+                <w:color w:val="000000"/>
+                <w:sz w:val="18"/>
+                <w:szCs w:val="18"/>
+              </w:rPr>
+              <w:t xml:space="preserve">OLD-FORM response — weekend max unknown; confirm full week 5 incl. weekend is OK</w:t>
+            </w:r>
+          </w:p>
+        </w:tc>
+      </w:tr>
+      <w:tr>
+        <w:tc>
+          <w:tcPr>
+            <w:tcW w:type="dxa" w:w="2400"/>
+            <w:tcMar>
+              <w:top w:type="dxa" w:w="60"/>
+              <w:left w:type="dxa" w:w="80"/>
+              <w:bottom w:type="dxa" w:w="60"/>
+              <w:right w:type="dxa" w:w="80"/>
+            </w:tcMar>
+            <w:vAlign w:val="center"/>
+          </w:tcPr>
+          <w:p>
+            <w:pPr>
+              <w:jc w:val="center"/>
+            </w:pPr>
+            <w:r>
+              <w:rPr>
+                <w:rFonts w:ascii="Calibri" w:cs="Calibri" w:eastAsia="Calibri" w:hAnsi="Calibri"/>
+                <w:b w:val="false"/>
+                <w:bCs w:val="false"/>
+                <w:i w:val="false"/>
+                <w:iCs w:val="false"/>
+                <w:color w:val="000000"/>
+                <w:sz w:val="18"/>
+                <w:szCs w:val="18"/>
+              </w:rPr>
+              <w:t xml:space="preserve">Dr. Konrad</w:t>
+            </w:r>
+          </w:p>
+        </w:tc>
+        <w:tc>
+          <w:tcPr>
+            <w:tcW w:type="dxa" w:w="1700"/>
+            <w:tcMar>
+              <w:top w:type="dxa" w:w="60"/>
+              <w:left w:type="dxa" w:w="80"/>
+              <w:bottom w:type="dxa" w:w="60"/>
+              <w:right w:type="dxa" w:w="80"/>
+            </w:tcMar>
+            <w:vAlign w:val="center"/>
+          </w:tcPr>
+          <w:p>
+            <w:pPr>
+              <w:jc w:val="center"/>
+            </w:pPr>
+            <w:r>
+              <w:rPr>
+                <w:rFonts w:ascii="Calibri" w:cs="Calibri" w:eastAsia="Calibri" w:hAnsi="Calibri"/>
+                <w:b w:val="false"/>
+                <w:bCs w:val="false"/>
+                <w:i w:val="false"/>
+                <w:iCs w:val="false"/>
+                <w:color w:val="000000"/>
+                <w:sz w:val="18"/>
+                <w:szCs w:val="18"/>
+              </w:rPr>
+              <w:t xml:space="preserve">2 / 2</w:t>
+            </w:r>
+          </w:p>
+        </w:tc>
+        <w:tc>
+          <w:tcPr>
+            <w:tcW w:type="dxa" w:w="1700"/>
+            <w:tcMar>
+              <w:top w:type="dxa" w:w="60"/>
+              <w:left w:type="dxa" w:w="80"/>
+              <w:bottom w:type="dxa" w:w="60"/>
+              <w:right w:type="dxa" w:w="80"/>
+            </w:tcMar>
+            <w:vAlign w:val="center"/>
+          </w:tcPr>
+          <w:p>
+            <w:pPr>
+              <w:jc w:val="center"/>
+            </w:pPr>
+            <w:r>
+              <w:rPr>
+                <w:rFonts w:ascii="Calibri" w:cs="Calibri" w:eastAsia="Calibri" w:hAnsi="Calibri"/>
+                <w:b w:val="false"/>
+                <w:bCs w:val="false"/>
+                <w:i w:val="false"/>
+                <w:iCs w:val="false"/>
+                <w:color w:val="000000"/>
+                <w:sz w:val="18"/>
+                <w:szCs w:val="18"/>
+              </w:rPr>
+              <w:t xml:space="preserve">—</w:t>
+            </w:r>
+          </w:p>
+        </w:tc>
+        <w:tc>
+          <w:tcPr>
+            <w:tcW w:type="dxa" w:w="1700"/>
+            <w:tcMar>
+              <w:top w:type="dxa" w:w="60"/>
+              <w:left w:type="dxa" w:w="80"/>
+              <w:bottom w:type="dxa" w:w="60"/>
+              <w:right w:type="dxa" w:w="80"/>
+            </w:tcMar>
+            <w:vAlign w:val="center"/>
+          </w:tcPr>
+          <w:p>
+            <w:pPr>
+              <w:jc w:val="center"/>
+            </w:pPr>
+            <w:r>
+              <w:rPr>
+                <w:rFonts w:ascii="Calibri" w:cs="Calibri" w:eastAsia="Calibri" w:hAnsi="Calibri"/>
+                <w:b w:val="false"/>
+                <w:bCs w:val="false"/>
+                <w:i w:val="false"/>
+                <w:iCs w:val="false"/>
+                <w:color w:val="000000"/>
+                <w:sz w:val="18"/>
+                <w:szCs w:val="18"/>
+              </w:rPr>
+              <w:t xml:space="preserve">2 / 2</w:t>
+            </w:r>
+          </w:p>
+        </w:tc>
+        <w:tc>
+          <w:tcPr>
+            <w:tcW w:type="dxa" w:w="6900"/>
+            <w:tcMar>
+              <w:top w:type="dxa" w:w="60"/>
+              <w:left w:type="dxa" w:w="80"/>
+              <w:bottom w:type="dxa" w:w="60"/>
+              <w:right w:type="dxa" w:w="80"/>
+            </w:tcMar>
+            <w:vAlign w:val="center"/>
+          </w:tcPr>
+          <w:p>
+            <w:pPr>
+              <w:jc w:val="center"/>
+            </w:pPr>
+            <w:r>
+              <w:rPr>
+                <w:rFonts w:ascii="Calibri" w:cs="Calibri" w:eastAsia="Calibri" w:hAnsi="Calibri"/>
+                <w:b w:val="false"/>
+                <w:bCs w:val="false"/>
+                <w:i w:val="false"/>
+                <w:iCs w:val="false"/>
+                <w:color w:val="000000"/>
+                <w:sz w:val="18"/>
+                <w:szCs w:val="18"/>
+              </w:rPr>
+              <w:t xml:space="preserve">Full weeks 8 and 10 (1st choice)</w:t>
+            </w:r>
+          </w:p>
+        </w:tc>
+      </w:tr>
+      <w:tr>
+        <w:tc>
+          <w:tcPr>
+            <w:tcW w:type="dxa" w:w="2400"/>
+            <w:tcMar>
+              <w:top w:type="dxa" w:w="60"/>
+              <w:left w:type="dxa" w:w="80"/>
+              <w:bottom w:type="dxa" w:w="60"/>
+              <w:right w:type="dxa" w:w="80"/>
+            </w:tcMar>
+            <w:vAlign w:val="center"/>
+          </w:tcPr>
+          <w:p>
+            <w:pPr>
+              <w:jc w:val="center"/>
+            </w:pPr>
+            <w:r>
+              <w:rPr>
+                <w:rFonts w:ascii="Calibri" w:cs="Calibri" w:eastAsia="Calibri" w:hAnsi="Calibri"/>
+                <w:b w:val="false"/>
+                <w:bCs w:val="false"/>
+                <w:i w:val="false"/>
+                <w:iCs w:val="false"/>
+                <w:color w:val="000000"/>
+                <w:sz w:val="18"/>
+                <w:szCs w:val="18"/>
+              </w:rPr>
+              <w:t xml:space="preserve">Dr. Kuzenko</w:t>
+            </w:r>
+          </w:p>
+        </w:tc>
+        <w:tc>
+          <w:tcPr>
+            <w:tcW w:type="dxa" w:w="1700"/>
+            <w:tcMar>
+              <w:top w:type="dxa" w:w="60"/>
+              <w:left w:type="dxa" w:w="80"/>
+              <w:bottom w:type="dxa" w:w="60"/>
+              <w:right w:type="dxa" w:w="80"/>
+            </w:tcMar>
+            <w:vAlign w:val="center"/>
+          </w:tcPr>
+          <w:p>
+            <w:pPr>
+              <w:jc w:val="center"/>
+            </w:pPr>
+            <w:r>
+              <w:rPr>
+                <w:rFonts w:ascii="Calibri" w:cs="Calibri" w:eastAsia="Calibri" w:hAnsi="Calibri"/>
+                <w:b w:val="false"/>
+                <w:bCs w:val="false"/>
+                <w:i w:val="false"/>
+                <w:iCs w:val="false"/>
+                <w:color w:val="000000"/>
+                <w:sz w:val="18"/>
+                <w:szCs w:val="18"/>
+              </w:rPr>
+              <w:t xml:space="preserve">2 / 2</w:t>
+            </w:r>
+          </w:p>
+        </w:tc>
+        <w:tc>
+          <w:tcPr>
+            <w:tcW w:type="dxa" w:w="1700"/>
+            <w:tcMar>
+              <w:top w:type="dxa" w:w="60"/>
+              <w:left w:type="dxa" w:w="80"/>
+              <w:bottom w:type="dxa" w:w="60"/>
+              <w:right w:type="dxa" w:w="80"/>
+            </w:tcMar>
+            <w:vAlign w:val="center"/>
+          </w:tcPr>
+          <w:p>
+            <w:pPr>
+              <w:jc w:val="center"/>
+            </w:pPr>
+            <w:r>
+              <w:rPr>
+                <w:rFonts w:ascii="Calibri" w:cs="Calibri" w:eastAsia="Calibri" w:hAnsi="Calibri"/>
+                <w:b w:val="false"/>
+                <w:bCs w:val="false"/>
+                <w:i w:val="false"/>
+                <w:iCs w:val="false"/>
+                <w:color w:val="000000"/>
+                <w:sz w:val="18"/>
+                <w:szCs w:val="18"/>
+              </w:rPr>
+              <w:t xml:space="preserve">—</w:t>
+            </w:r>
+          </w:p>
+        </w:tc>
+        <w:tc>
+          <w:tcPr>
+            <w:tcW w:type="dxa" w:w="1700"/>
+            <w:tcMar>
+              <w:top w:type="dxa" w:w="60"/>
+              <w:left w:type="dxa" w:w="80"/>
+              <w:bottom w:type="dxa" w:w="60"/>
+              <w:right w:type="dxa" w:w="80"/>
+            </w:tcMar>
+            <w:vAlign w:val="center"/>
+          </w:tcPr>
+          <w:p>
+            <w:pPr>
+              <w:jc w:val="center"/>
+            </w:pPr>
+            <w:r>
+              <w:rPr>
+                <w:rFonts w:ascii="Calibri" w:cs="Calibri" w:eastAsia="Calibri" w:hAnsi="Calibri"/>
+                <w:b w:val="false"/>
+                <w:bCs w:val="false"/>
+                <w:i w:val="false"/>
+                <w:iCs w:val="false"/>
+                <w:color w:val="000000"/>
+                <w:sz w:val="18"/>
+                <w:szCs w:val="18"/>
+              </w:rPr>
+              <w:t xml:space="preserve">2 / 2</w:t>
+            </w:r>
+          </w:p>
+        </w:tc>
+        <w:tc>
+          <w:tcPr>
+            <w:tcW w:type="dxa" w:w="6900"/>
+            <w:tcMar>
+              <w:top w:type="dxa" w:w="60"/>
+              <w:left w:type="dxa" w:w="80"/>
+              <w:bottom w:type="dxa" w:w="60"/>
+              <w:right w:type="dxa" w:w="80"/>
+            </w:tcMar>
+            <w:vAlign w:val="center"/>
+          </w:tcPr>
+          <w:p>
+            <w:pPr>
+              <w:jc w:val="center"/>
+            </w:pPr>
+            <w:r>
+              <w:rPr>
+                <w:rFonts w:ascii="Calibri" w:cs="Calibri" w:eastAsia="Calibri" w:hAnsi="Calibri"/>
+                <w:b w:val="false"/>
+                <w:bCs w:val="false"/>
+                <w:i w:val="false"/>
+                <w:iCs w:val="false"/>
+                <w:color w:val="000000"/>
+                <w:sz w:val="18"/>
+                <w:szCs w:val="18"/>
+              </w:rPr>
+              <w:t xml:space="preserve">Full weeks 1 and 7 — 1st choice (W10) went to Dr. Konrad, who had no other weeks</w:t>
+            </w:r>
+          </w:p>
+        </w:tc>
+      </w:tr>
+      <w:tr>
+        <w:tc>
+          <w:tcPr>
+            <w:tcW w:type="dxa" w:w="2400"/>
+            <w:tcMar>
+              <w:top w:type="dxa" w:w="60"/>
+              <w:left w:type="dxa" w:w="80"/>
+              <w:bottom w:type="dxa" w:w="60"/>
+              <w:right w:type="dxa" w:w="80"/>
+            </w:tcMar>
+            <w:vAlign w:val="center"/>
+          </w:tcPr>
+          <w:p>
+            <w:pPr>
+              <w:jc w:val="center"/>
+            </w:pPr>
+            <w:r>
+              <w:rPr>
+                <w:rFonts w:ascii="Calibri" w:cs="Calibri" w:eastAsia="Calibri" w:hAnsi="Calibri"/>
+                <w:b w:val="false"/>
+                <w:bCs w:val="false"/>
+                <w:i w:val="false"/>
+                <w:iCs w:val="false"/>
+                <w:color w:val="000000"/>
+                <w:sz w:val="18"/>
+                <w:szCs w:val="18"/>
+              </w:rPr>
+              <w:t xml:space="preserve">Dr. Okoye</w:t>
+            </w:r>
+          </w:p>
+        </w:tc>
+        <w:tc>
+          <w:tcPr>
+            <w:tcW w:type="dxa" w:w="1700"/>
+            <w:tcMar>
+              <w:top w:type="dxa" w:w="60"/>
+              <w:left w:type="dxa" w:w="80"/>
+              <w:bottom w:type="dxa" w:w="60"/>
+              <w:right w:type="dxa" w:w="80"/>
+            </w:tcMar>
+            <w:vAlign w:val="center"/>
+          </w:tcPr>
+          <w:p>
+            <w:pPr>
+              <w:jc w:val="center"/>
+            </w:pPr>
+            <w:r>
+              <w:rPr>
+                <w:rFonts w:ascii="Calibri" w:cs="Calibri" w:eastAsia="Calibri" w:hAnsi="Calibri"/>
+                <w:b w:val="false"/>
+                <w:bCs w:val="false"/>
+                <w:i w:val="false"/>
+                <w:iCs w:val="false"/>
+                <w:color w:val="000000"/>
+                <w:sz w:val="18"/>
+                <w:szCs w:val="18"/>
+              </w:rPr>
+              <w:t xml:space="preserve">1 / 2</w:t>
+            </w:r>
+          </w:p>
+        </w:tc>
+        <w:tc>
+          <w:tcPr>
+            <w:tcW w:type="dxa" w:w="1700"/>
+            <w:tcMar>
+              <w:top w:type="dxa" w:w="60"/>
+              <w:left w:type="dxa" w:w="80"/>
+              <w:bottom w:type="dxa" w:w="60"/>
+              <w:right w:type="dxa" w:w="80"/>
+            </w:tcMar>
+            <w:vAlign w:val="center"/>
+          </w:tcPr>
+          <w:p>
+            <w:pPr>
+              <w:jc w:val="center"/>
+            </w:pPr>
+            <w:r>
+              <w:rPr>
+                <w:rFonts w:ascii="Calibri" w:cs="Calibri" w:eastAsia="Calibri" w:hAnsi="Calibri"/>
+                <w:b w:val="false"/>
+                <w:bCs w:val="false"/>
+                <w:i w:val="false"/>
+                <w:iCs w:val="false"/>
+                <w:color w:val="000000"/>
+                <w:sz w:val="18"/>
+                <w:szCs w:val="18"/>
+              </w:rPr>
+              <w:t xml:space="preserve">3 / 4</w:t>
+            </w:r>
+          </w:p>
+        </w:tc>
+        <w:tc>
+          <w:tcPr>
+            <w:tcW w:type="dxa" w:w="1700"/>
+            <w:tcMar>
+              <w:top w:type="dxa" w:w="60"/>
+              <w:left w:type="dxa" w:w="80"/>
+              <w:bottom w:type="dxa" w:w="60"/>
+              <w:right w:type="dxa" w:w="80"/>
+            </w:tcMar>
+            <w:vAlign w:val="center"/>
+          </w:tcPr>
+          <w:p>
+            <w:pPr>
+              <w:jc w:val="center"/>
+            </w:pPr>
+            <w:r>
+              <w:rPr>
+                <w:rFonts w:ascii="Calibri" w:cs="Calibri" w:eastAsia="Calibri" w:hAnsi="Calibri"/>
+                <w:b w:val="false"/>
+                <w:bCs w:val="false"/>
+                <w:i w:val="false"/>
+                <w:iCs w:val="false"/>
+                <w:color w:val="000000"/>
+                <w:sz w:val="18"/>
+                <w:szCs w:val="18"/>
+              </w:rPr>
+              <w:t xml:space="preserve">5 / 5</w:t>
+            </w:r>
+          </w:p>
+        </w:tc>
+        <w:tc>
+          <w:tcPr>
+            <w:tcW w:type="dxa" w:w="6900"/>
+            <w:tcMar>
+              <w:top w:type="dxa" w:w="60"/>
+              <w:left w:type="dxa" w:w="80"/>
+              <w:bottom w:type="dxa" w:w="60"/>
+              <w:right w:type="dxa" w:w="80"/>
+            </w:tcMar>
+            <w:vAlign w:val="center"/>
+          </w:tcPr>
+          <w:p>
+            <w:pPr>
+              <w:jc w:val="center"/>
+            </w:pPr>
+            <w:r>
+              <w:rPr>
+                <w:rFonts w:ascii="Calibri" w:cs="Calibri" w:eastAsia="Calibri" w:hAnsi="Calibri"/>
+                <w:b w:val="false"/>
+                <w:bCs w:val="false"/>
+                <w:i w:val="false"/>
+                <w:iCs w:val="false"/>
+                <w:color w:val="000000"/>
+                <w:sz w:val="18"/>
+                <w:szCs w:val="18"/>
+              </w:rPr>
+              <w:t xml:space="preserve">Evening week 2 = his 1st-choice Mon–Fri and weekend picks; day week 3 (3rd choice); at weekend max</w:t>
+            </w:r>
+          </w:p>
+        </w:tc>
+      </w:tr>
+      <w:tr>
+        <w:tc>
+          <w:tcPr>
+            <w:tcW w:type="dxa" w:w="2400"/>
+            <w:tcMar>
+              <w:top w:type="dxa" w:w="60"/>
+              <w:left w:type="dxa" w:w="80"/>
+              <w:bottom w:type="dxa" w:w="60"/>
+              <w:right w:type="dxa" w:w="80"/>
+            </w:tcMar>
+            <w:vAlign w:val="center"/>
+          </w:tcPr>
+          <w:p>
+            <w:pPr>
+              <w:jc w:val="center"/>
+            </w:pPr>
+            <w:r>
+              <w:rPr>
+                <w:rFonts w:ascii="Calibri" w:cs="Calibri" w:eastAsia="Calibri" w:hAnsi="Calibri"/>
+                <w:b w:val="false"/>
+                <w:bCs w:val="false"/>
+                <w:i w:val="false"/>
+                <w:iCs w:val="false"/>
+                <w:color w:val="000000"/>
+                <w:sz w:val="18"/>
+                <w:szCs w:val="18"/>
+              </w:rPr>
+              <w:t xml:space="preserve">Dr. Palay</w:t>
+            </w:r>
+          </w:p>
+        </w:tc>
+        <w:tc>
+          <w:tcPr>
+            <w:tcW w:type="dxa" w:w="1700"/>
+            <w:tcMar>
+              <w:top w:type="dxa" w:w="60"/>
+              <w:left w:type="dxa" w:w="80"/>
+              <w:bottom w:type="dxa" w:w="60"/>
+              <w:right w:type="dxa" w:w="80"/>
+            </w:tcMar>
+            <w:vAlign w:val="center"/>
+          </w:tcPr>
+          <w:p>
+            <w:pPr>
+              <w:jc w:val="center"/>
+            </w:pPr>
+            <w:r>
+              <w:rPr>
+                <w:rFonts w:ascii="Calibri" w:cs="Calibri" w:eastAsia="Calibri" w:hAnsi="Calibri"/>
+                <w:b w:val="false"/>
+                <w:bCs w:val="false"/>
+                <w:i w:val="false"/>
+                <w:iCs w:val="false"/>
+                <w:color w:val="000000"/>
+                <w:sz w:val="18"/>
+                <w:szCs w:val="18"/>
+              </w:rPr>
+              <w:t xml:space="preserve">—</w:t>
+            </w:r>
+          </w:p>
+        </w:tc>
+        <w:tc>
+          <w:tcPr>
+            <w:tcW w:type="dxa" w:w="1700"/>
+            <w:tcMar>
+              <w:top w:type="dxa" w:w="60"/>
+              <w:left w:type="dxa" w:w="80"/>
+              <w:bottom w:type="dxa" w:w="60"/>
+              <w:right w:type="dxa" w:w="80"/>
+            </w:tcMar>
+            <w:vAlign w:val="center"/>
+          </w:tcPr>
+          <w:p>
+            <w:pPr>
+              <w:jc w:val="center"/>
+            </w:pPr>
+            <w:r>
+              <w:rPr>
+                <w:rFonts w:ascii="Calibri" w:cs="Calibri" w:eastAsia="Calibri" w:hAnsi="Calibri"/>
+                <w:b w:val="false"/>
+                <w:bCs w:val="false"/>
+                <w:i w:val="false"/>
+                <w:iCs w:val="false"/>
+                <w:color w:val="000000"/>
+                <w:sz w:val="18"/>
+                <w:szCs w:val="18"/>
+              </w:rPr>
+              <w:t xml:space="preserve">1 / 1</w:t>
+            </w:r>
+          </w:p>
+        </w:tc>
+        <w:tc>
+          <w:tcPr>
+            <w:tcW w:type="dxa" w:w="1700"/>
+            <w:tcMar>
+              <w:top w:type="dxa" w:w="60"/>
+              <w:left w:type="dxa" w:w="80"/>
+              <w:bottom w:type="dxa" w:w="60"/>
+              <w:right w:type="dxa" w:w="80"/>
+            </w:tcMar>
+            <w:vAlign w:val="center"/>
+          </w:tcPr>
+          <w:p>
+            <w:pPr>
+              <w:jc w:val="center"/>
+            </w:pPr>
+            <w:r>
+              <w:rPr>
+                <w:rFonts w:ascii="Calibri" w:cs="Calibri" w:eastAsia="Calibri" w:hAnsi="Calibri"/>
+                <w:b w:val="false"/>
+                <w:bCs w:val="false"/>
+                <w:i w:val="false"/>
+                <w:iCs w:val="false"/>
+                <w:color w:val="000000"/>
+                <w:sz w:val="18"/>
+                <w:szCs w:val="18"/>
+              </w:rPr>
+              <w:t xml:space="preserve">1 / 1</w:t>
+            </w:r>
+          </w:p>
+        </w:tc>
+        <w:tc>
+          <w:tcPr>
+            <w:tcW w:type="dxa" w:w="6900"/>
+            <w:tcMar>
+              <w:top w:type="dxa" w:w="60"/>
+              <w:left w:type="dxa" w:w="80"/>
+              <w:bottom w:type="dxa" w:w="60"/>
+              <w:right w:type="dxa" w:w="80"/>
+            </w:tcMar>
+            <w:vAlign w:val="center"/>
+          </w:tcPr>
+          <w:p>
+            <w:pPr>
+              <w:jc w:val="center"/>
+            </w:pPr>
+            <w:r>
+              <w:rPr>
+                <w:rFonts w:ascii="Calibri" w:cs="Calibri" w:eastAsia="Calibri" w:hAnsi="Calibri"/>
+                <w:b w:val="false"/>
+                <w:bCs w:val="false"/>
+                <w:i w:val="false"/>
+                <w:iCs w:val="false"/>
+                <w:color w:val="000000"/>
+                <w:sz w:val="18"/>
+                <w:szCs w:val="18"/>
+              </w:rPr>
+              <w:t xml:space="preserve">Full week 6 (evening) — his 1st choice</w:t>
+            </w:r>
+          </w:p>
+        </w:tc>
+      </w:tr>
+      <w:tr>
+        <w:tc>
+          <w:tcPr>
+            <w:tcW w:type="dxa" w:w="2400"/>
+            <w:tcMar>
+              <w:top w:type="dxa" w:w="60"/>
+              <w:left w:type="dxa" w:w="80"/>
+              <w:bottom w:type="dxa" w:w="60"/>
+              <w:right w:type="dxa" w:w="80"/>
+            </w:tcMar>
+            <w:vAlign w:val="center"/>
+          </w:tcPr>
+          <w:p>
+            <w:pPr>
+              <w:jc w:val="center"/>
+            </w:pPr>
+            <w:r>
+              <w:rPr>
+                <w:rFonts w:ascii="Calibri" w:cs="Calibri" w:eastAsia="Calibri" w:hAnsi="Calibri"/>
+                <w:b w:val="false"/>
+                <w:bCs w:val="false"/>
+                <w:i w:val="false"/>
+                <w:iCs w:val="false"/>
+                <w:color w:val="000000"/>
+                <w:sz w:val="18"/>
+                <w:szCs w:val="18"/>
+              </w:rPr>
+              <w:t xml:space="preserve">Dr. Ruzhynsky</w:t>
+            </w:r>
+          </w:p>
+        </w:tc>
+        <w:tc>
+          <w:tcPr>
+            <w:tcW w:type="dxa" w:w="1700"/>
+            <w:tcMar>
+              <w:top w:type="dxa" w:w="60"/>
+              <w:left w:type="dxa" w:w="80"/>
+              <w:bottom w:type="dxa" w:w="60"/>
+              <w:right w:type="dxa" w:w="80"/>
+            </w:tcMar>
+            <w:vAlign w:val="center"/>
+          </w:tcPr>
+          <w:p>
+            <w:pPr>
+              <w:jc w:val="center"/>
+            </w:pPr>
+            <w:r>
+              <w:rPr>
+                <w:rFonts w:ascii="Calibri" w:cs="Calibri" w:eastAsia="Calibri" w:hAnsi="Calibri"/>
+                <w:b w:val="false"/>
+                <w:bCs w:val="false"/>
+                <w:i w:val="false"/>
+                <w:iCs w:val="false"/>
+                <w:color w:val="000000"/>
+                <w:sz w:val="18"/>
+                <w:szCs w:val="18"/>
+              </w:rPr>
+              <w:t xml:space="preserve">—</w:t>
+            </w:r>
+          </w:p>
+        </w:tc>
+        <w:tc>
+          <w:tcPr>
+            <w:tcW w:type="dxa" w:w="1700"/>
+            <w:tcMar>
+              <w:top w:type="dxa" w:w="60"/>
+              <w:left w:type="dxa" w:w="80"/>
+              <w:bottom w:type="dxa" w:w="60"/>
+              <w:right w:type="dxa" w:w="80"/>
+            </w:tcMar>
+            <w:vAlign w:val="center"/>
+          </w:tcPr>
+          <w:p>
+            <w:pPr>
+              <w:jc w:val="center"/>
+            </w:pPr>
+            <w:r>
+              <w:rPr>
+                <w:rFonts w:ascii="Calibri" w:cs="Calibri" w:eastAsia="Calibri" w:hAnsi="Calibri"/>
+                <w:b w:val="false"/>
+                <w:bCs w:val="false"/>
+                <w:i w:val="false"/>
+                <w:iCs w:val="false"/>
+                <w:color w:val="000000"/>
+                <w:sz w:val="18"/>
+                <w:szCs w:val="18"/>
+              </w:rPr>
+              <w:t xml:space="preserve">2 / 2</w:t>
+            </w:r>
+          </w:p>
+        </w:tc>
+        <w:tc>
+          <w:tcPr>
+            <w:tcW w:type="dxa" w:w="1700"/>
+            <w:tcMar>
+              <w:top w:type="dxa" w:w="60"/>
+              <w:left w:type="dxa" w:w="80"/>
+              <w:bottom w:type="dxa" w:w="60"/>
+              <w:right w:type="dxa" w:w="80"/>
+            </w:tcMar>
+            <w:vAlign w:val="center"/>
+          </w:tcPr>
+          <w:p>
+            <w:pPr>
+              <w:jc w:val="center"/>
+            </w:pPr>
+            <w:r>
+              <w:rPr>
+                <w:rFonts w:ascii="Calibri" w:cs="Calibri" w:eastAsia="Calibri" w:hAnsi="Calibri"/>
+                <w:b w:val="false"/>
+                <w:bCs w:val="false"/>
+                <w:i w:val="false"/>
+                <w:iCs w:val="false"/>
+                <w:color w:val="000000"/>
+                <w:sz w:val="18"/>
+                <w:szCs w:val="18"/>
+              </w:rPr>
+              <w:t xml:space="preserve">2 / 3</w:t>
+            </w:r>
+          </w:p>
+        </w:tc>
+        <w:tc>
+          <w:tcPr>
+            <w:tcW w:type="dxa" w:w="6900"/>
+            <w:tcMar>
+              <w:top w:type="dxa" w:w="60"/>
+              <w:left w:type="dxa" w:w="80"/>
+              <w:bottom w:type="dxa" w:w="60"/>
+              <w:right w:type="dxa" w:w="80"/>
+            </w:tcMar>
+            <w:vAlign w:val="center"/>
+          </w:tcPr>
+          <w:p>
+            <w:pPr>
+              <w:jc w:val="center"/>
+            </w:pPr>
+            <w:r>
+              <w:rPr>
+                <w:rFonts w:ascii="Calibri" w:cs="Calibri" w:eastAsia="Calibri" w:hAnsi="Calibri"/>
+                <w:b w:val="false"/>
+                <w:bCs w:val="false"/>
+                <w:i w:val="false"/>
+                <w:iCs w:val="false"/>
+                <w:color w:val="000000"/>
+                <w:sz w:val="18"/>
+                <w:szCs w:val="18"/>
+              </w:rPr>
+              <w:t xml:space="preserve">Full weeks 4 and 7 (evening) — 1st and 2nd choices</w:t>
+            </w:r>
+          </w:p>
+        </w:tc>
+      </w:tr>
+      <w:tr>
+        <w:tc>
+          <w:tcPr>
+            <w:tcW w:type="dxa" w:w="2400"/>
+            <w:tcMar>
+              <w:top w:type="dxa" w:w="60"/>
+              <w:left w:type="dxa" w:w="80"/>
+              <w:bottom w:type="dxa" w:w="60"/>
+              <w:right w:type="dxa" w:w="80"/>
+            </w:tcMar>
+            <w:vAlign w:val="center"/>
+          </w:tcPr>
+          <w:p>
+            <w:pPr>
+              <w:jc w:val="center"/>
+            </w:pPr>
+            <w:r>
+              <w:rPr>
+                <w:rFonts w:ascii="Calibri" w:cs="Calibri" w:eastAsia="Calibri" w:hAnsi="Calibri"/>
+                <w:b w:val="false"/>
+                <w:bCs w:val="false"/>
+                <w:i w:val="false"/>
+                <w:iCs w:val="false"/>
+                <w:color w:val="000000"/>
+                <w:sz w:val="18"/>
+                <w:szCs w:val="18"/>
+              </w:rPr>
+              <w:t xml:space="preserve">Dr. Sawich</w:t>
+            </w:r>
+          </w:p>
+        </w:tc>
+        <w:tc>
+          <w:tcPr>
+            <w:tcW w:type="dxa" w:w="1700"/>
+            <w:tcMar>
+              <w:top w:type="dxa" w:w="60"/>
+              <w:left w:type="dxa" w:w="80"/>
+              <w:bottom w:type="dxa" w:w="60"/>
+              <w:right w:type="dxa" w:w="80"/>
+            </w:tcMar>
+            <w:vAlign w:val="center"/>
+          </w:tcPr>
+          <w:p>
+            <w:pPr>
+              <w:jc w:val="center"/>
+            </w:pPr>
+            <w:r>
+              <w:rPr>
+                <w:rFonts w:ascii="Calibri" w:cs="Calibri" w:eastAsia="Calibri" w:hAnsi="Calibri"/>
+                <w:b w:val="false"/>
+                <w:bCs w:val="false"/>
+                <w:i w:val="false"/>
+                <w:iCs w:val="false"/>
+                <w:color w:val="000000"/>
+                <w:sz w:val="18"/>
+                <w:szCs w:val="18"/>
+              </w:rPr>
+              <w:t xml:space="preserve">1 / 1</w:t>
+            </w:r>
+          </w:p>
+        </w:tc>
+        <w:tc>
+          <w:tcPr>
+            <w:tcW w:type="dxa" w:w="1700"/>
+            <w:tcMar>
+              <w:top w:type="dxa" w:w="60"/>
+              <w:left w:type="dxa" w:w="80"/>
+              <w:bottom w:type="dxa" w:w="60"/>
+              <w:right w:type="dxa" w:w="80"/>
+            </w:tcMar>
+            <w:vAlign w:val="center"/>
+          </w:tcPr>
+          <w:p>
+            <w:pPr>
+              <w:jc w:val="center"/>
+            </w:pPr>
+            <w:r>
+              <w:rPr>
+                <w:rFonts w:ascii="Calibri" w:cs="Calibri" w:eastAsia="Calibri" w:hAnsi="Calibri"/>
+                <w:b w:val="false"/>
+                <w:bCs w:val="false"/>
+                <w:i w:val="false"/>
+                <w:iCs w:val="false"/>
+                <w:color w:val="000000"/>
+                <w:sz w:val="18"/>
+                <w:szCs w:val="18"/>
+              </w:rPr>
+              <w:t xml:space="preserve">1 / 1</w:t>
+            </w:r>
+          </w:p>
+        </w:tc>
+        <w:tc>
+          <w:tcPr>
+            <w:tcW w:type="dxa" w:w="1700"/>
+            <w:tcMar>
+              <w:top w:type="dxa" w:w="60"/>
+              <w:left w:type="dxa" w:w="80"/>
+              <w:bottom w:type="dxa" w:w="60"/>
+              <w:right w:type="dxa" w:w="80"/>
+            </w:tcMar>
+            <w:vAlign w:val="center"/>
+          </w:tcPr>
+          <w:p>
+            <w:pPr>
+              <w:jc w:val="center"/>
+            </w:pPr>
+            <w:r>
+              <w:rPr>
+                <w:rFonts w:ascii="Calibri" w:cs="Calibri" w:eastAsia="Calibri" w:hAnsi="Calibri"/>
+                <w:b w:val="false"/>
+                <w:bCs w:val="false"/>
+                <w:i w:val="false"/>
+                <w:iCs w:val="false"/>
+                <w:color w:val="000000"/>
+                <w:sz w:val="18"/>
+                <w:szCs w:val="18"/>
+              </w:rPr>
+              <w:t xml:space="preserve">1 / 1</w:t>
+            </w:r>
+          </w:p>
+        </w:tc>
+        <w:tc>
+          <w:tcPr>
+            <w:tcW w:type="dxa" w:w="6900"/>
+            <w:tcMar>
+              <w:top w:type="dxa" w:w="60"/>
+              <w:left w:type="dxa" w:w="80"/>
+              <w:bottom w:type="dxa" w:w="60"/>
+              <w:right w:type="dxa" w:w="80"/>
+            </w:tcMar>
+            <w:vAlign w:val="center"/>
+          </w:tcPr>
+          <w:p>
+            <w:pPr>
+              <w:jc w:val="center"/>
+            </w:pPr>
+            <w:r>
+              <w:rPr>
+                <w:rFonts w:ascii="Calibri" w:cs="Calibri" w:eastAsia="Calibri" w:hAnsi="Calibri"/>
+                <w:b w:val="false"/>
+                <w:bCs w:val="false"/>
+                <w:i w:val="false"/>
+                <w:iCs w:val="false"/>
+                <w:color w:val="000000"/>
+                <w:sz w:val="18"/>
+                <w:szCs w:val="18"/>
+              </w:rPr>
+              <w:t xml:space="preserve">Day full week 6 — her 1st choice; evening Mon–Fri week 3 (2nd choice)</w:t>
+            </w:r>
+          </w:p>
+        </w:tc>
+      </w:tr>
+    </w:tbl>
+    <w:p>
+      <w:pPr>
+        <w:pStyle w:val="Heading2"/>
+        <w:spacing w:after="120" w:before="240"/>
+      </w:pPr>
+      <w:r>
+        <w:rPr>
+          <w:rFonts w:ascii="Calibri" w:cs="Calibri" w:eastAsia="Calibri" w:hAnsi="Calibri"/>
+          <w:b/>
+          <w:bCs/>
+          <w:color w:val="1F3864"/>
+          <w:sz w:val="24"/>
+          <w:szCs w:val="24"/>
+        </w:rPr>
+        <w:t xml:space="preserve">Option B: flags</w:t>
+      </w:r>
+    </w:p>
+    <w:p>
+      <w:pPr>
+        <w:spacing w:after="80"/>
+      </w:pPr>
+      <w:r>
+        <w:rPr>
+          <w:rFonts w:ascii="Calibri" w:cs="Calibri" w:eastAsia="Calibri" w:hAnsi="Calibri"/>
+          <w:b w:val="false"/>
+          <w:bCs w:val="false"/>
+          <w:i w:val="false"/>
+          <w:iCs w:val="false"/>
+          <w:color w:val="000000"/>
+          <w:sz w:val="20"/>
+          <w:szCs w:val="20"/>
+        </w:rPr>
+        <w:t xml:space="preserve">• 8 of 11 respondents receive one of their 1st choices (Drs. Okoye, Konrad, Gill, Ruzhynsky, Sawich, Bolton, Palay, Classen) — vs 5 in Option A.</w:t>
+      </w:r>
+    </w:p>
+    <w:p>
+      <w:pPr>
+        <w:spacing w:after="80"/>
+      </w:pPr>
+      <w:r>
+        <w:rPr>
+          <w:rFonts w:ascii="Calibri" w:cs="Calibri" w:eastAsia="Calibri" w:hAnsi="Calibri"/>
+          <w:b w:val="false"/>
+          <w:bCs w:val="false"/>
+          <w:i w:val="false"/>
+          <w:iCs w:val="false"/>
+          <w:color w:val="000000"/>
+          <w:sz w:val="20"/>
+          <w:szCs w:val="20"/>
+        </w:rPr>
+        <w:t xml:space="preserve">• Dr. Okoye works 14 consecutive days Sep 7–20 (evening week 2, then day week 3), plus day weekend 4.</w:t>
+      </w:r>
+    </w:p>
+    <w:p>
+      <w:pPr>
+        <w:spacing w:after="80"/>
+      </w:pPr>
+      <w:r>
+        <w:rPr>
+          <w:rFonts w:ascii="Calibri" w:cs="Calibri" w:eastAsia="Calibri" w:hAnsi="Calibri"/>
+          <w:b w:val="false"/>
+          <w:bCs w:val="false"/>
+          <w:i w:val="false"/>
+          <w:iCs w:val="false"/>
+          <w:color w:val="000000"/>
+          <w:sz w:val="20"/>
+          <w:szCs w:val="20"/>
+        </w:rPr>
+        <w:t xml:space="preserve">• Differences from Option A: Bolton W9↔W7 with Kuzenko/Sawich reshuffle; Classen moves to day W2 + evening W5/W9; Okoye trades day W2 for day W3 + evening W2. Open block shifts from evening weekend 8 to evening weekend 3.</w:t>
+      </w:r>
+    </w:p>
+    <w:p>
+      <w:pPr>
+        <w:pStyle w:val="Heading2"/>
+        <w:spacing w:after="120" w:before="240"/>
+      </w:pPr>
+      <w:r>
+        <w:rPr>
+          <w:rFonts w:ascii="Calibri" w:cs="Calibri" w:eastAsia="Calibri" w:hAnsi="Calibri"/>
+          <w:b/>
+          <w:bCs/>
+          <w:color w:val="1F3864"/>
+          <w:sz w:val="24"/>
+          <w:szCs w:val="24"/>
+        </w:rPr>
+        <w:t xml:space="preserve">Shared notes (both options)</w:t>
+      </w:r>
+    </w:p>
+    <w:p>
+      <w:pPr>
+        <w:spacing w:after="80"/>
+      </w:pPr>
+      <w:r>
+        <w:rPr>
+          <w:rFonts w:ascii="Calibri" w:cs="Calibri" w:eastAsia="Calibri" w:hAnsi="Calibri"/>
+          <w:b w:val="false"/>
+          <w:bCs w:val="false"/>
+          <w:i w:val="false"/>
+          <w:iCs w:val="false"/>
+          <w:color w:val="000000"/>
+          <w:sz w:val="20"/>
+          <w:szCs w:val="20"/>
+        </w:rPr>
+        <w:t xml:space="preserve">• All 20 day-shift blocks are filled in both options. Offer open evening blocks as individual days, or to the 7 psychiatrists who have not yet responded: Drs. Adelufosi, Bezzahou, Harrington, Paletta, Reimer, Sareen, Zylberman.</w:t>
       </w:r>
     </w:p>
     <w:p>
@@ -4550,7 +9106,25 @@
           <w:sz w:val="20"/>
           <w:szCs w:val="20"/>
         </w:rPr>
-        <w:t xml:space="preserve">• Draft based on 11 of 18 responses (deadline Aug 5). Any late submissions could fill the open evening blocks.</w:t>
+        <w:t xml:space="preserve">• Drs. Kuzenko and Brainch both ranked week 10 first; it must go to Dr. Konrad in every full-coverage solution, since weeks 8 and 10 are his only availability.</w:t>
+      </w:r>
+    </w:p>
+    <w:p>
+      <w:pPr>
+        <w:spacing w:after="80"/>
+      </w:pPr>
+      <w:r>
+        <w:rPr>
+          <w:rFonts w:ascii="Calibri" w:cs="Calibri" w:eastAsia="Calibri" w:hAnsi="Calibri"/>
+          <w:b w:val="false"/>
+          <w:bCs w:val="false"/>
+          <w:i w:val="false"/>
+          <w:iCs w:val="false"/>
+          <w:color w:val="000000"/>
+          <w:sz w:val="20"/>
+          <w:szCs w:val="20"/>
+        </w:rPr>
+        <w:t xml:space="preserve">• The no-consecutive-weeks rule was deliberately switched off in both options.</w:t>
       </w:r>
     </w:p>
     <w:sectPr>

</xml_diff>